<commit_message>
Module 6 lab: full ICICI Pillar 3 dataset, one Word file per RBI table in filing order
bank_data.json now carries one block per RBI table, DF-1 to DF-18, every real
figure page-cited to the bank's March 2025 disclosure. build_pillar3.py
reconciles the ratios to the published ones before writing anything, then
writes 18 table files in order plus a filing log; tables with no data are
written as stubs that say so. Lab page, card and deck slide 7 updated.

Co-Authored-By: Claude Fable 5.1 <noreply@anthropic.com>
</commit_message>
<xml_diff>
--- a/labs/module-06-pillar3/Pillar3_Disclosure_ICICI_Mar2025.docx
+++ b/labs/module-06-pillar3/Pillar3_Disclosure_ICICI_Mar2025.docx
@@ -7,7 +7,7 @@
         <w:pStyle w:val="Title"/>
       </w:pPr>
       <w:r>
-        <w:t>Basel III Pillar 3 Disclosures</w:t>
+        <w:t>Basel III Pillar 3 Disclosures: filing set</w:t>
       </w:r>
     </w:p>
     <w:p>
@@ -16,7 +16,7 @@
           <w:b/>
           <w:i w:val="0"/>
         </w:rPr>
-        <w:t>ICICI Bank Limited (consolidated)  |  as at 31 March 2025  |  figures in INR million</w:t>
+        <w:t>ICICI Bank Limited (consolidated)  |  31 March 2025  |  INR million</w:t>
       </w:r>
     </w:p>
     <w:p>
@@ -24,14 +24,254 @@
         <w:rPr>
           <w:b w:val="0"/>
           <w:i/>
+        </w:rPr>
+        <w:t>One section per RBI table, generated from bank_data.json. See 00_filing_log.csv for the status of each.</w:t>
+      </w:r>
+    </w:p>
+    <w:sectPr>
+      <w:pgSz w:w="12240" w:h="15840"/>
+      <w:pgMar w:top="1440" w:right="1800" w:bottom="1440" w:left="1800" w:header="720" w:footer="720" w:gutter="0"/>
+      <w:cols w:space="720"/>
+      <w:docGrid w:linePitch="360"/>
+    </w:sectPr>
+    <w:p>
+      <w:pPr>
+        <w:pStyle w:val="Title"/>
+      </w:pPr>
+      <w:r>
+        <w:t>Table DF-1: Scope of Application</w:t>
+      </w:r>
+    </w:p>
+    <w:p>
+      <w:r>
+        <w:rPr>
+          <w:b/>
+        </w:rPr>
+        <w:t>ICICI Bank Limited (consolidated)  |  31 March 2025  |  INR million</w:t>
+      </w:r>
+    </w:p>
+    <w:p>
+      <w:r>
+        <w:rPr>
+          <w:i/>
           <w:sz w:val="18"/>
         </w:rPr>
-        <w:t>Generated from structured data by the Module 6 lab script. Capital and leverage inputs are the bank's published figures; liquidity inputs are illustrative teaching values and are marked as such.</w:t>
+        <w:t>Source: ICICI Bank, Basel III Pillar 3 Disclosures at March 31, 2025 (76 pages), pages 1-8. Data status: partial.</w:t>
+      </w:r>
+    </w:p>
+    <w:p>
+      <w:r>
+        <w:rPr>
+          <w:b/>
+          <w:i w:val="0"/>
+        </w:rPr>
+        <w:t>Group entities named in the disclosure:</w:t>
+      </w:r>
+    </w:p>
+    <w:tbl>
+      <w:tblPr>
+        <w:tblStyle w:val="LightGrid-Accent1"/>
+        <w:tblW w:type="auto" w:w="0"/>
+        <w:tblLook w:firstColumn="1" w:firstRow="1" w:lastColumn="0" w:lastRow="0" w:noHBand="0" w:noVBand="1" w:val="04A0"/>
+      </w:tblPr>
+      <w:tblGrid>
+        <w:gridCol w:w="4320"/>
+        <w:gridCol w:w="4320"/>
+      </w:tblGrid>
+      <w:tr>
+        <w:tc>
+          <w:tcPr>
+            <w:tcW w:type="dxa" w:w="4320"/>
+          </w:tcPr>
+          <w:p>
+            <w:r/>
+            <w:r>
+              <w:rPr>
+                <w:b/>
+              </w:rPr>
+              <w:t>Entity</w:t>
+            </w:r>
+          </w:p>
+        </w:tc>
+        <w:tc>
+          <w:tcPr>
+            <w:tcW w:type="dxa" w:w="4320"/>
+          </w:tcPr>
+          <w:p>
+            <w:r/>
+            <w:r>
+              <w:rPr>
+                <w:b/>
+              </w:rPr>
+              <w:t>Consolidation treatment</w:t>
+            </w:r>
+          </w:p>
+        </w:tc>
+      </w:tr>
+      <w:tr>
+        <w:tc>
+          <w:tcPr>
+            <w:tcW w:type="dxa" w:w="4320"/>
+          </w:tcPr>
+          <w:p>
+            <w:r>
+              <w:t>ICICI Bank UK PLC</w:t>
+            </w:r>
+          </w:p>
+        </w:tc>
+        <w:tc>
+          <w:tcPr>
+            <w:tcW w:type="dxa" w:w="4320"/>
+          </w:tcPr>
+          <w:p>
+            <w:pPr>
+              <w:jc w:val="right"/>
+            </w:pPr>
+            <w:r>
+              <w:t>see PDF pages 1-8</w:t>
+            </w:r>
+          </w:p>
+        </w:tc>
+      </w:tr>
+      <w:tr>
+        <w:tc>
+          <w:tcPr>
+            <w:tcW w:type="dxa" w:w="4320"/>
+          </w:tcPr>
+          <w:p>
+            <w:r>
+              <w:t>ICICI Bank Canada</w:t>
+            </w:r>
+          </w:p>
+        </w:tc>
+        <w:tc>
+          <w:tcPr>
+            <w:tcW w:type="dxa" w:w="4320"/>
+          </w:tcPr>
+          <w:p>
+            <w:pPr>
+              <w:jc w:val="right"/>
+            </w:pPr>
+            <w:r>
+              <w:t>see PDF pages 1-8</w:t>
+            </w:r>
+          </w:p>
+        </w:tc>
+      </w:tr>
+      <w:tr>
+        <w:tc>
+          <w:tcPr>
+            <w:tcW w:type="dxa" w:w="4320"/>
+          </w:tcPr>
+          <w:p>
+            <w:r>
+              <w:t>ICICI Prudential Life Insurance</w:t>
+            </w:r>
+          </w:p>
+        </w:tc>
+        <w:tc>
+          <w:tcPr>
+            <w:tcW w:type="dxa" w:w="4320"/>
+          </w:tcPr>
+          <w:p>
+            <w:pPr>
+              <w:jc w:val="right"/>
+            </w:pPr>
+            <w:r>
+              <w:t>see PDF pages 1-8</w:t>
+            </w:r>
+          </w:p>
+        </w:tc>
+      </w:tr>
+      <w:tr>
+        <w:tc>
+          <w:tcPr>
+            <w:tcW w:type="dxa" w:w="4320"/>
+          </w:tcPr>
+          <w:p>
+            <w:r>
+              <w:t>ICICI Lombard General Insurance</w:t>
+            </w:r>
+          </w:p>
+        </w:tc>
+        <w:tc>
+          <w:tcPr>
+            <w:tcW w:type="dxa" w:w="4320"/>
+          </w:tcPr>
+          <w:p>
+            <w:pPr>
+              <w:jc w:val="right"/>
+            </w:pPr>
+            <w:r>
+              <w:t>see PDF pages 1-8</w:t>
+            </w:r>
+          </w:p>
+        </w:tc>
+      </w:tr>
+      <w:tr>
+        <w:tc>
+          <w:tcPr>
+            <w:tcW w:type="dxa" w:w="4320"/>
+          </w:tcPr>
+          <w:p>
+            <w:r>
+              <w:t>ICICI Venture Funds Management</w:t>
+            </w:r>
+          </w:p>
+        </w:tc>
+        <w:tc>
+          <w:tcPr>
+            <w:tcW w:type="dxa" w:w="4320"/>
+          </w:tcPr>
+          <w:p>
+            <w:pPr>
+              <w:jc w:val="right"/>
+            </w:pPr>
+            <w:r>
+              <w:t>see PDF pages 1-8</w:t>
+            </w:r>
+          </w:p>
+        </w:tc>
+      </w:tr>
+      <w:tr>
+        <w:tc>
+          <w:tcPr>
+            <w:tcW w:type="dxa" w:w="4320"/>
+          </w:tcPr>
+          <w:p>
+            <w:r>
+              <w:t>ICICI Home Finance</w:t>
+            </w:r>
+          </w:p>
+        </w:tc>
+        <w:tc>
+          <w:tcPr>
+            <w:tcW w:type="dxa" w:w="4320"/>
+          </w:tcPr>
+          <w:p>
+            <w:pPr>
+              <w:jc w:val="right"/>
+            </w:pPr>
+            <w:r>
+              <w:t>see PDF pages 1-8</w:t>
+            </w:r>
+          </w:p>
+        </w:tc>
+      </w:tr>
+    </w:tbl>
+    <w:p/>
+    <w:p>
+      <w:r>
+        <w:rPr>
+          <w:b w:val="0"/>
+          <w:i/>
+        </w:rPr>
+        <w:t>Entity names as they appear on pages 2-3 and 12. Consolidation treatment per entity (full / pro-rata / deducted) is not in this file; read it from the PDF.</w:t>
       </w:r>
     </w:p>
     <w:p>
       <w:pPr>
-        <w:pStyle w:val="Heading1"/>
+        <w:pStyle w:val="Title"/>
       </w:pPr>
       <w:r>
         <w:t>Table DF-2: Capital Adequacy</w:t>
@@ -41,9 +281,17 @@
       <w:r>
         <w:rPr>
           <w:b/>
-          <w:i w:val="0"/>
         </w:rPr>
-        <w:t>Qualitative disclosure</w:t>
+        <w:t>ICICI Bank Limited (consolidated)  |  31 March 2025  |  INR million</w:t>
+      </w:r>
+    </w:p>
+    <w:p>
+      <w:r>
+        <w:rPr>
+          <w:i/>
+          <w:sz w:val="18"/>
+        </w:rPr>
+        <w:t>Source: ICICI Bank, Basel III Pillar 3 Disclosures at March 31, 2025 (76 pages), pages 9-12. Data status: complete.</w:t>
       </w:r>
     </w:p>
     <w:p>
@@ -52,7 +300,7 @@
           <w:b w:val="0"/>
           <w:i w:val="0"/>
         </w:rPr>
-        <w:t>The Bank is identified as a Domestic Systemically Important Bank and holds the D-SIB surcharge of 0.20% over the capital conservation buffer of 2.50%. The applicable minimum total capital ratio is therefore 11.70% of risk weighted assets.</w:t>
+        <w:t>The Bank is a Domestic Systemically Important Bank. Minimum total capital ratio including the 2.5% capital conservation buffer and the 0.2% D-SIB surcharge is 11.70% of risk weighted assets.</w:t>
       </w:r>
     </w:p>
     <w:p>
@@ -61,7 +309,7 @@
           <w:b/>
           <w:i w:val="0"/>
         </w:rPr>
-        <w:t>Quantitative disclosure: capital requirements</w:t>
+        <w:t>Capital requirements</w:t>
       </w:r>
     </w:p>
     <w:tbl>
@@ -126,7 +374,79 @@
           </w:tcPr>
           <w:p>
             <w:r>
-              <w:t>(b) Credit risk (standardised approach)</w:t>
+              <w:t>(b) Credit risk: standardised approach</w:t>
+            </w:r>
+          </w:p>
+        </w:tc>
+        <w:tc>
+          <w:tcPr>
+            <w:tcW w:type="dxa" w:w="2880"/>
+          </w:tcPr>
+          <w:p>
+            <w:pPr>
+              <w:jc w:val="right"/>
+            </w:pPr>
+            <w:r>
+              <w:t>1,747,501.0</w:t>
+            </w:r>
+          </w:p>
+        </w:tc>
+        <w:tc>
+          <w:tcPr>
+            <w:tcW w:type="dxa" w:w="2880"/>
+          </w:tcPr>
+          <w:p>
+            <w:pPr>
+              <w:jc w:val="right"/>
+            </w:pPr>
+            <w:r/>
+          </w:p>
+        </w:tc>
+      </w:tr>
+      <w:tr>
+        <w:tc>
+          <w:tcPr>
+            <w:tcW w:type="dxa" w:w="2880"/>
+          </w:tcPr>
+          <w:p>
+            <w:r>
+              <w:t xml:space="preserve">      of which securitisation exposures</w:t>
+            </w:r>
+          </w:p>
+        </w:tc>
+        <w:tc>
+          <w:tcPr>
+            <w:tcW w:type="dxa" w:w="2880"/>
+          </w:tcPr>
+          <w:p>
+            <w:pPr>
+              <w:jc w:val="right"/>
+            </w:pPr>
+            <w:r>
+              <w:t>6,220.4</w:t>
+            </w:r>
+          </w:p>
+        </w:tc>
+        <w:tc>
+          <w:tcPr>
+            <w:tcW w:type="dxa" w:w="2880"/>
+          </w:tcPr>
+          <w:p>
+            <w:pPr>
+              <w:jc w:val="right"/>
+            </w:pPr>
+            <w:r/>
+          </w:p>
+        </w:tc>
+      </w:tr>
+      <w:tr>
+        <w:tc>
+          <w:tcPr>
+            <w:tcW w:type="dxa" w:w="2880"/>
+          </w:tcPr>
+          <w:p>
+            <w:r>
+              <w:t xml:space="preserve">      Credit risk total</w:t>
             </w:r>
           </w:p>
         </w:tc>
@@ -164,7 +484,7 @@
           </w:tcPr>
           <w:p>
             <w:r>
-              <w:t>(c) Market risk (standardised duration approach)</w:t>
+              <w:t>(c) Market risk: standardised duration approach</w:t>
             </w:r>
           </w:p>
         </w:tc>
@@ -202,7 +522,7 @@
           </w:tcPr>
           <w:p>
             <w:r>
-              <w:t>(d) Operational risk (basic indicator approach)</w:t>
+              <w:t>(d) Operational risk: basic indicator approach</w:t>
             </w:r>
           </w:p>
         </w:tc>
@@ -279,7 +599,7 @@
           <w:b/>
           <w:i w:val="0"/>
         </w:rPr>
-        <w:t>Quantitative disclosure: capital ratios</w:t>
+        <w:t>Capital ratios</w:t>
       </w:r>
     </w:p>
     <w:tbl>
@@ -289,15 +609,16 @@
         <w:tblLook w:firstColumn="1" w:firstRow="1" w:lastColumn="0" w:lastRow="0" w:noHBand="0" w:noVBand="1" w:val="04A0"/>
       </w:tblPr>
       <w:tblGrid>
-        <w:gridCol w:w="2160"/>
-        <w:gridCol w:w="2160"/>
-        <w:gridCol w:w="2160"/>
-        <w:gridCol w:w="2160"/>
+        <w:gridCol w:w="1728"/>
+        <w:gridCol w:w="1728"/>
+        <w:gridCol w:w="1728"/>
+        <w:gridCol w:w="1728"/>
+        <w:gridCol w:w="1728"/>
       </w:tblGrid>
       <w:tr>
         <w:tc>
           <w:tcPr>
-            <w:tcW w:type="dxa" w:w="2160"/>
+            <w:tcW w:type="dxa" w:w="1728"/>
           </w:tcPr>
           <w:p>
             <w:r/>
@@ -311,7 +632,7 @@
         </w:tc>
         <w:tc>
           <w:tcPr>
-            <w:tcW w:type="dxa" w:w="2160"/>
+            <w:tcW w:type="dxa" w:w="1728"/>
           </w:tcPr>
           <w:p>
             <w:r/>
@@ -325,7 +646,21 @@
         </w:tc>
         <w:tc>
           <w:tcPr>
-            <w:tcW w:type="dxa" w:w="2160"/>
+            <w:tcW w:type="dxa" w:w="1728"/>
+          </w:tcPr>
+          <w:p>
+            <w:r/>
+            <w:r>
+              <w:rPr>
+                <w:b/>
+              </w:rPr>
+              <w:t>Published</w:t>
+            </w:r>
+          </w:p>
+        </w:tc>
+        <w:tc>
+          <w:tcPr>
+            <w:tcW w:type="dxa" w:w="1728"/>
           </w:tcPr>
           <w:p>
             <w:r/>
@@ -339,7 +674,7 @@
         </w:tc>
         <w:tc>
           <w:tcPr>
-            <w:tcW w:type="dxa" w:w="2160"/>
+            <w:tcW w:type="dxa" w:w="1728"/>
           </w:tcPr>
           <w:p>
             <w:r/>
@@ -355,7 +690,7 @@
       <w:tr>
         <w:tc>
           <w:tcPr>
-            <w:tcW w:type="dxa" w:w="2160"/>
+            <w:tcW w:type="dxa" w:w="1728"/>
           </w:tcPr>
           <w:p>
             <w:r>
@@ -365,7 +700,7 @@
         </w:tc>
         <w:tc>
           <w:tcPr>
-            <w:tcW w:type="dxa" w:w="2160"/>
+            <w:tcW w:type="dxa" w:w="1728"/>
           </w:tcPr>
           <w:p>
             <w:pPr>
@@ -378,7 +713,20 @@
         </w:tc>
         <w:tc>
           <w:tcPr>
-            <w:tcW w:type="dxa" w:w="2160"/>
+            <w:tcW w:type="dxa" w:w="1728"/>
+          </w:tcPr>
+          <w:p>
+            <w:pPr>
+              <w:jc w:val="right"/>
+            </w:pPr>
+            <w:r>
+              <w:t>15.81%</w:t>
+            </w:r>
+          </w:p>
+        </w:tc>
+        <w:tc>
+          <w:tcPr>
+            <w:tcW w:type="dxa" w:w="1728"/>
           </w:tcPr>
           <w:p>
             <w:pPr>
@@ -391,7 +739,7 @@
         </w:tc>
         <w:tc>
           <w:tcPr>
-            <w:tcW w:type="dxa" w:w="2160"/>
+            <w:tcW w:type="dxa" w:w="1728"/>
           </w:tcPr>
           <w:p>
             <w:pPr>
@@ -406,7 +754,7 @@
       <w:tr>
         <w:tc>
           <w:tcPr>
-            <w:tcW w:type="dxa" w:w="2160"/>
+            <w:tcW w:type="dxa" w:w="1728"/>
           </w:tcPr>
           <w:p>
             <w:r>
@@ -416,7 +764,7 @@
         </w:tc>
         <w:tc>
           <w:tcPr>
-            <w:tcW w:type="dxa" w:w="2160"/>
+            <w:tcW w:type="dxa" w:w="1728"/>
           </w:tcPr>
           <w:p>
             <w:pPr>
@@ -429,7 +777,20 @@
         </w:tc>
         <w:tc>
           <w:tcPr>
-            <w:tcW w:type="dxa" w:w="2160"/>
+            <w:tcW w:type="dxa" w:w="1728"/>
+          </w:tcPr>
+          <w:p>
+            <w:pPr>
+              <w:jc w:val="right"/>
+            </w:pPr>
+            <w:r>
+              <w:t>15.81%</w:t>
+            </w:r>
+          </w:p>
+        </w:tc>
+        <w:tc>
+          <w:tcPr>
+            <w:tcW w:type="dxa" w:w="1728"/>
           </w:tcPr>
           <w:p>
             <w:pPr>
@@ -442,7 +803,7 @@
         </w:tc>
         <w:tc>
           <w:tcPr>
-            <w:tcW w:type="dxa" w:w="2160"/>
+            <w:tcW w:type="dxa" w:w="1728"/>
           </w:tcPr>
           <w:p>
             <w:pPr>
@@ -457,7 +818,7 @@
       <w:tr>
         <w:tc>
           <w:tcPr>
-            <w:tcW w:type="dxa" w:w="2160"/>
+            <w:tcW w:type="dxa" w:w="1728"/>
           </w:tcPr>
           <w:p>
             <w:r>
@@ -467,7 +828,7 @@
         </w:tc>
         <w:tc>
           <w:tcPr>
-            <w:tcW w:type="dxa" w:w="2160"/>
+            <w:tcW w:type="dxa" w:w="1728"/>
           </w:tcPr>
           <w:p>
             <w:pPr>
@@ -480,7 +841,20 @@
         </w:tc>
         <w:tc>
           <w:tcPr>
-            <w:tcW w:type="dxa" w:w="2160"/>
+            <w:tcW w:type="dxa" w:w="1728"/>
+          </w:tcPr>
+          <w:p>
+            <w:pPr>
+              <w:jc w:val="right"/>
+            </w:pPr>
+            <w:r>
+              <w:t>16.41%</w:t>
+            </w:r>
+          </w:p>
+        </w:tc>
+        <w:tc>
+          <w:tcPr>
+            <w:tcW w:type="dxa" w:w="1728"/>
           </w:tcPr>
           <w:p>
             <w:pPr>
@@ -493,7 +867,7 @@
         </w:tc>
         <w:tc>
           <w:tcPr>
-            <w:tcW w:type="dxa" w:w="2160"/>
+            <w:tcW w:type="dxa" w:w="1728"/>
           </w:tcPr>
           <w:p>
             <w:pPr>
@@ -513,7 +887,7 @@
           <w:b/>
           <w:i w:val="0"/>
         </w:rPr>
-        <w:t>Composition of capital</w:t>
+        <w:t>Composition of capital funds</w:t>
       </w:r>
     </w:p>
     <w:tbl>
@@ -563,7 +937,7 @@
           </w:tcPr>
           <w:p>
             <w:r>
-              <w:t>Common Equity Tier 1 capital</w:t>
+              <w:t>Common Equity Tier 1</w:t>
             </w:r>
           </w:p>
         </w:tc>
@@ -588,7 +962,7 @@
           </w:tcPr>
           <w:p>
             <w:r>
-              <w:t>Additional Tier 1 capital</w:t>
+              <w:t>Additional Tier 1</w:t>
             </w:r>
           </w:p>
         </w:tc>
@@ -613,7 +987,7 @@
           </w:tcPr>
           <w:p>
             <w:r>
-              <w:t>Tier 1 capital</w:t>
+              <w:t>Tier 1</w:t>
             </w:r>
           </w:p>
         </w:tc>
@@ -638,7 +1012,7 @@
           </w:tcPr>
           <w:p>
             <w:r>
-              <w:t>Tier 2 capital</w:t>
+              <w:t>Tier 2</w:t>
             </w:r>
           </w:p>
         </w:tc>
@@ -709,11 +1083,46 @@
     </w:tbl>
     <w:p/>
     <w:p>
+      <w:r>
+        <w:rPr>
+          <w:b w:val="0"/>
+          <w:i w:val="0"/>
+        </w:rPr>
+        <w:t>Subsidiary ratios as published: ICICI Bank UK PLC CET1 19.57% / total 22.60%; ICICI Bank Canada CET1 17.96% / total 18.45%; standalone bank CET1 15.94% / total 16.55%.</w:t>
+      </w:r>
+    </w:p>
+    <w:p>
       <w:pPr>
-        <w:pStyle w:val="Heading1"/>
+        <w:pStyle w:val="Title"/>
       </w:pPr>
       <w:r>
-        <w:t>Table DF-18: Leverage Ratio</w:t>
+        <w:t>Table DF-3: Credit Risk: General Disclosures</w:t>
+      </w:r>
+    </w:p>
+    <w:p>
+      <w:r>
+        <w:rPr>
+          <w:b/>
+        </w:rPr>
+        <w:t>ICICI Bank Limited (consolidated)  |  31 March 2025  |  INR million</w:t>
+      </w:r>
+    </w:p>
+    <w:p>
+      <w:r>
+        <w:rPr>
+          <w:i/>
+          <w:sz w:val="18"/>
+        </w:rPr>
+        <w:t>Source: ICICI Bank, Basel III Pillar 3 Disclosures at March 31, 2025 (76 pages), pages 13-26. Data status: complete.</w:t>
+      </w:r>
+    </w:p>
+    <w:p>
+      <w:r>
+        <w:rPr>
+          <w:b/>
+          <w:i w:val="0"/>
+        </w:rPr>
+        <w:t>Non-performing assets</w:t>
       </w:r>
     </w:p>
     <w:tbl>
@@ -763,7 +1172,2163 @@
           </w:tcPr>
           <w:p>
             <w:r>
-              <w:t>On-balance sheet exposures</w:t>
+              <w:t>Sub-standard</w:t>
+            </w:r>
+          </w:p>
+        </w:tc>
+        <w:tc>
+          <w:tcPr>
+            <w:tcW w:type="dxa" w:w="4320"/>
+          </w:tcPr>
+          <w:p>
+            <w:pPr>
+              <w:jc w:val="right"/>
+            </w:pPr>
+            <w:r>
+              <w:t>97,931.2</w:t>
+            </w:r>
+          </w:p>
+        </w:tc>
+      </w:tr>
+      <w:tr>
+        <w:tc>
+          <w:tcPr>
+            <w:tcW w:type="dxa" w:w="4320"/>
+          </w:tcPr>
+          <w:p>
+            <w:r>
+              <w:t>Doubtful</w:t>
+            </w:r>
+          </w:p>
+        </w:tc>
+        <w:tc>
+          <w:tcPr>
+            <w:tcW w:type="dxa" w:w="4320"/>
+          </w:tcPr>
+          <w:p>
+            <w:pPr>
+              <w:jc w:val="right"/>
+            </w:pPr>
+            <w:r>
+              <w:t>77,263.1</w:t>
+            </w:r>
+          </w:p>
+        </w:tc>
+      </w:tr>
+      <w:tr>
+        <w:tc>
+          <w:tcPr>
+            <w:tcW w:type="dxa" w:w="4320"/>
+          </w:tcPr>
+          <w:p>
+            <w:r>
+              <w:t>Loss</w:t>
+            </w:r>
+          </w:p>
+        </w:tc>
+        <w:tc>
+          <w:tcPr>
+            <w:tcW w:type="dxa" w:w="4320"/>
+          </w:tcPr>
+          <w:p>
+            <w:pPr>
+              <w:jc w:val="right"/>
+            </w:pPr>
+            <w:r>
+              <w:t>68,115.8</w:t>
+            </w:r>
+          </w:p>
+        </w:tc>
+      </w:tr>
+      <w:tr>
+        <w:tc>
+          <w:tcPr>
+            <w:tcW w:type="dxa" w:w="4320"/>
+          </w:tcPr>
+          <w:p>
+            <w:r>
+              <w:t>Gross NPAs</w:t>
+            </w:r>
+          </w:p>
+        </w:tc>
+        <w:tc>
+          <w:tcPr>
+            <w:tcW w:type="dxa" w:w="4320"/>
+          </w:tcPr>
+          <w:p>
+            <w:pPr>
+              <w:jc w:val="right"/>
+            </w:pPr>
+            <w:r>
+              <w:t>243,310.1</w:t>
+            </w:r>
+          </w:p>
+        </w:tc>
+      </w:tr>
+      <w:tr>
+        <w:tc>
+          <w:tcPr>
+            <w:tcW w:type="dxa" w:w="4320"/>
+          </w:tcPr>
+          <w:p>
+            <w:r>
+              <w:t>Net NPAs</w:t>
+            </w:r>
+          </w:p>
+        </w:tc>
+        <w:tc>
+          <w:tcPr>
+            <w:tcW w:type="dxa" w:w="4320"/>
+          </w:tcPr>
+          <w:p>
+            <w:pPr>
+              <w:jc w:val="right"/>
+            </w:pPr>
+            <w:r>
+              <w:t>61,554.0</w:t>
+            </w:r>
+          </w:p>
+        </w:tc>
+      </w:tr>
+      <w:tr>
+        <w:tc>
+          <w:tcPr>
+            <w:tcW w:type="dxa" w:w="4320"/>
+          </w:tcPr>
+          <w:p>
+            <w:r>
+              <w:t>Gross NPA ratio</w:t>
+            </w:r>
+          </w:p>
+        </w:tc>
+        <w:tc>
+          <w:tcPr>
+            <w:tcW w:type="dxa" w:w="4320"/>
+          </w:tcPr>
+          <w:p>
+            <w:pPr>
+              <w:jc w:val="right"/>
+            </w:pPr>
+            <w:r>
+              <w:t>1.68%</w:t>
+            </w:r>
+          </w:p>
+        </w:tc>
+      </w:tr>
+      <w:tr>
+        <w:tc>
+          <w:tcPr>
+            <w:tcW w:type="dxa" w:w="4320"/>
+          </w:tcPr>
+          <w:p>
+            <w:r>
+              <w:t>Net NPA ratio</w:t>
+            </w:r>
+          </w:p>
+        </w:tc>
+        <w:tc>
+          <w:tcPr>
+            <w:tcW w:type="dxa" w:w="4320"/>
+          </w:tcPr>
+          <w:p>
+            <w:pPr>
+              <w:jc w:val="right"/>
+            </w:pPr>
+            <w:r>
+              <w:t>0.43%</w:t>
+            </w:r>
+          </w:p>
+        </w:tc>
+      </w:tr>
+    </w:tbl>
+    <w:p/>
+    <w:p>
+      <w:r>
+        <w:rPr>
+          <w:b/>
+          <w:i w:val="0"/>
+        </w:rPr>
+        <w:t>Movement of gross NPAs</w:t>
+      </w:r>
+    </w:p>
+    <w:tbl>
+      <w:tblPr>
+        <w:tblStyle w:val="LightGrid-Accent1"/>
+        <w:tblW w:type="auto" w:w="0"/>
+        <w:tblLook w:firstColumn="1" w:firstRow="1" w:lastColumn="0" w:lastRow="0" w:noHBand="0" w:noVBand="1" w:val="04A0"/>
+      </w:tblPr>
+      <w:tblGrid>
+        <w:gridCol w:w="4320"/>
+        <w:gridCol w:w="4320"/>
+      </w:tblGrid>
+      <w:tr>
+        <w:tc>
+          <w:tcPr>
+            <w:tcW w:type="dxa" w:w="4320"/>
+          </w:tcPr>
+          <w:p>
+            <w:r/>
+            <w:r>
+              <w:rPr>
+                <w:b/>
+              </w:rPr>
+              <w:t>Item</w:t>
+            </w:r>
+          </w:p>
+        </w:tc>
+        <w:tc>
+          <w:tcPr>
+            <w:tcW w:type="dxa" w:w="4320"/>
+          </w:tcPr>
+          <w:p>
+            <w:r/>
+            <w:r>
+              <w:rPr>
+                <w:b/>
+              </w:rPr>
+              <w:t>Amount</w:t>
+            </w:r>
+          </w:p>
+        </w:tc>
+      </w:tr>
+      <w:tr>
+        <w:tc>
+          <w:tcPr>
+            <w:tcW w:type="dxa" w:w="4320"/>
+          </w:tcPr>
+          <w:p>
+            <w:r>
+              <w:t>Opening balance</w:t>
+            </w:r>
+          </w:p>
+        </w:tc>
+        <w:tc>
+          <w:tcPr>
+            <w:tcW w:type="dxa" w:w="4320"/>
+          </w:tcPr>
+          <w:p>
+            <w:pPr>
+              <w:jc w:val="right"/>
+            </w:pPr>
+            <w:r>
+              <w:t>279,608.2</w:t>
+            </w:r>
+          </w:p>
+        </w:tc>
+      </w:tr>
+      <w:tr>
+        <w:tc>
+          <w:tcPr>
+            <w:tcW w:type="dxa" w:w="4320"/>
+          </w:tcPr>
+          <w:p>
+            <w:r>
+              <w:t>Additions</w:t>
+            </w:r>
+          </w:p>
+        </w:tc>
+        <w:tc>
+          <w:tcPr>
+            <w:tcW w:type="dxa" w:w="4320"/>
+          </w:tcPr>
+          <w:p>
+            <w:pPr>
+              <w:jc w:val="right"/>
+            </w:pPr>
+            <w:r>
+              <w:t>209,758.6</w:t>
+            </w:r>
+          </w:p>
+        </w:tc>
+      </w:tr>
+      <w:tr>
+        <w:tc>
+          <w:tcPr>
+            <w:tcW w:type="dxa" w:w="4320"/>
+          </w:tcPr>
+          <w:p>
+            <w:r>
+              <w:t>Reductions</w:t>
+            </w:r>
+          </w:p>
+        </w:tc>
+        <w:tc>
+          <w:tcPr>
+            <w:tcW w:type="dxa" w:w="4320"/>
+          </w:tcPr>
+          <w:p>
+            <w:pPr>
+              <w:jc w:val="right"/>
+            </w:pPr>
+            <w:r>
+              <w:t>-246,056.7</w:t>
+            </w:r>
+          </w:p>
+        </w:tc>
+      </w:tr>
+      <w:tr>
+        <w:tc>
+          <w:tcPr>
+            <w:tcW w:type="dxa" w:w="4320"/>
+          </w:tcPr>
+          <w:p>
+            <w:r>
+              <w:t>Closing balance</w:t>
+            </w:r>
+          </w:p>
+        </w:tc>
+        <w:tc>
+          <w:tcPr>
+            <w:tcW w:type="dxa" w:w="4320"/>
+          </w:tcPr>
+          <w:p>
+            <w:pPr>
+              <w:jc w:val="right"/>
+            </w:pPr>
+            <w:r>
+              <w:t>243,310.1</w:t>
+            </w:r>
+          </w:p>
+        </w:tc>
+      </w:tr>
+    </w:tbl>
+    <w:p/>
+    <w:p>
+      <w:r>
+        <w:rPr>
+          <w:b/>
+          <w:i w:val="0"/>
+        </w:rPr>
+        <w:t>Provisions and non-performing investments</w:t>
+      </w:r>
+    </w:p>
+    <w:tbl>
+      <w:tblPr>
+        <w:tblStyle w:val="LightGrid-Accent1"/>
+        <w:tblW w:type="auto" w:w="0"/>
+        <w:tblLook w:firstColumn="1" w:firstRow="1" w:lastColumn="0" w:lastRow="0" w:noHBand="0" w:noVBand="1" w:val="04A0"/>
+      </w:tblPr>
+      <w:tblGrid>
+        <w:gridCol w:w="4320"/>
+        <w:gridCol w:w="4320"/>
+      </w:tblGrid>
+      <w:tr>
+        <w:tc>
+          <w:tcPr>
+            <w:tcW w:type="dxa" w:w="4320"/>
+          </w:tcPr>
+          <w:p>
+            <w:r/>
+            <w:r>
+              <w:rPr>
+                <w:b/>
+              </w:rPr>
+              <w:t>Item</w:t>
+            </w:r>
+          </w:p>
+        </w:tc>
+        <w:tc>
+          <w:tcPr>
+            <w:tcW w:type="dxa" w:w="4320"/>
+          </w:tcPr>
+          <w:p>
+            <w:r/>
+            <w:r>
+              <w:rPr>
+                <w:b/>
+              </w:rPr>
+              <w:t>Amount</w:t>
+            </w:r>
+          </w:p>
+        </w:tc>
+      </w:tr>
+      <w:tr>
+        <w:tc>
+          <w:tcPr>
+            <w:tcW w:type="dxa" w:w="4320"/>
+          </w:tcPr>
+          <w:p>
+            <w:r>
+              <w:t>Specific provisions, opening</w:t>
+            </w:r>
+          </w:p>
+        </w:tc>
+        <w:tc>
+          <w:tcPr>
+            <w:tcW w:type="dxa" w:w="4320"/>
+          </w:tcPr>
+          <w:p>
+            <w:pPr>
+              <w:jc w:val="right"/>
+            </w:pPr>
+            <w:r>
+              <w:t>222,692.2</w:t>
+            </w:r>
+          </w:p>
+        </w:tc>
+      </w:tr>
+      <w:tr>
+        <w:tc>
+          <w:tcPr>
+            <w:tcW w:type="dxa" w:w="4320"/>
+          </w:tcPr>
+          <w:p>
+            <w:r>
+              <w:t>Specific provisions, closing</w:t>
+            </w:r>
+          </w:p>
+        </w:tc>
+        <w:tc>
+          <w:tcPr>
+            <w:tcW w:type="dxa" w:w="4320"/>
+          </w:tcPr>
+          <w:p>
+            <w:pPr>
+              <w:jc w:val="right"/>
+            </w:pPr>
+            <w:r>
+              <w:t>182,656.4</w:t>
+            </w:r>
+          </w:p>
+        </w:tc>
+      </w:tr>
+      <w:tr>
+        <w:tc>
+          <w:tcPr>
+            <w:tcW w:type="dxa" w:w="4320"/>
+          </w:tcPr>
+          <w:p>
+            <w:r>
+              <w:t>General provisions, closing</w:t>
+            </w:r>
+          </w:p>
+        </w:tc>
+        <w:tc>
+          <w:tcPr>
+            <w:tcW w:type="dxa" w:w="4320"/>
+          </w:tcPr>
+          <w:p>
+            <w:pPr>
+              <w:jc w:val="right"/>
+            </w:pPr>
+            <w:r>
+              <w:t>67,581.2</w:t>
+            </w:r>
+          </w:p>
+        </w:tc>
+      </w:tr>
+      <w:tr>
+        <w:tc>
+          <w:tcPr>
+            <w:tcW w:type="dxa" w:w="4320"/>
+          </w:tcPr>
+          <w:p>
+            <w:r>
+              <w:t>Gross NPIs</w:t>
+            </w:r>
+          </w:p>
+        </w:tc>
+        <w:tc>
+          <w:tcPr>
+            <w:tcW w:type="dxa" w:w="4320"/>
+          </w:tcPr>
+          <w:p>
+            <w:pPr>
+              <w:jc w:val="right"/>
+            </w:pPr>
+            <w:r>
+              <w:t>32,155.6</w:t>
+            </w:r>
+          </w:p>
+        </w:tc>
+      </w:tr>
+      <w:tr>
+        <w:tc>
+          <w:tcPr>
+            <w:tcW w:type="dxa" w:w="4320"/>
+          </w:tcPr>
+          <w:p>
+            <w:r>
+              <w:t>Provisions for NPIs</w:t>
+            </w:r>
+          </w:p>
+        </w:tc>
+        <w:tc>
+          <w:tcPr>
+            <w:tcW w:type="dxa" w:w="4320"/>
+          </w:tcPr>
+          <w:p>
+            <w:pPr>
+              <w:jc w:val="right"/>
+            </w:pPr>
+            <w:r>
+              <w:t>-31,259.9</w:t>
+            </w:r>
+          </w:p>
+        </w:tc>
+      </w:tr>
+      <w:tr>
+        <w:tc>
+          <w:tcPr>
+            <w:tcW w:type="dxa" w:w="4320"/>
+          </w:tcPr>
+          <w:p>
+            <w:r>
+              <w:t>Net NPIs</w:t>
+            </w:r>
+          </w:p>
+        </w:tc>
+        <w:tc>
+          <w:tcPr>
+            <w:tcW w:type="dxa" w:w="4320"/>
+          </w:tcPr>
+          <w:p>
+            <w:pPr>
+              <w:jc w:val="right"/>
+            </w:pPr>
+            <w:r>
+              <w:t>895.7</w:t>
+            </w:r>
+          </w:p>
+        </w:tc>
+      </w:tr>
+    </w:tbl>
+    <w:p/>
+    <w:p>
+      <w:pPr>
+        <w:pStyle w:val="Title"/>
+      </w:pPr>
+      <w:r>
+        <w:t>Table DF-4: Credit Risk: Portfolios Subject to the Standardised Approach</w:t>
+      </w:r>
+    </w:p>
+    <w:p>
+      <w:r>
+        <w:rPr>
+          <w:b/>
+        </w:rPr>
+        <w:t>ICICI Bank Limited (consolidated)  |  31 March 2025  |  INR million</w:t>
+      </w:r>
+    </w:p>
+    <w:p>
+      <w:r>
+        <w:rPr>
+          <w:i/>
+          <w:sz w:val="18"/>
+        </w:rPr>
+        <w:t>Source: ICICI Bank, Basel III Pillar 3 Disclosures at March 31, 2025 (76 pages), pages 27-28. Data status: complete.</w:t>
+      </w:r>
+    </w:p>
+    <w:p>
+      <w:r>
+        <w:rPr>
+          <w:b/>
+          <w:i w:val="0"/>
+        </w:rPr>
+        <w:t>Credit exposures by risk weight, after credit risk mitigation</w:t>
+      </w:r>
+    </w:p>
+    <w:tbl>
+      <w:tblPr>
+        <w:tblStyle w:val="LightGrid-Accent1"/>
+        <w:tblW w:type="auto" w:w="0"/>
+        <w:tblLook w:firstColumn="1" w:firstRow="1" w:lastColumn="0" w:lastRow="0" w:noHBand="0" w:noVBand="1" w:val="04A0"/>
+      </w:tblPr>
+      <w:tblGrid>
+        <w:gridCol w:w="4320"/>
+        <w:gridCol w:w="4320"/>
+      </w:tblGrid>
+      <w:tr>
+        <w:tc>
+          <w:tcPr>
+            <w:tcW w:type="dxa" w:w="4320"/>
+          </w:tcPr>
+          <w:p>
+            <w:r/>
+            <w:r>
+              <w:rPr>
+                <w:b/>
+              </w:rPr>
+              <w:t>Risk weight bucket</w:t>
+            </w:r>
+          </w:p>
+        </w:tc>
+        <w:tc>
+          <w:tcPr>
+            <w:tcW w:type="dxa" w:w="4320"/>
+          </w:tcPr>
+          <w:p>
+            <w:r/>
+            <w:r>
+              <w:rPr>
+                <w:b/>
+              </w:rPr>
+              <w:t>Exposure</w:t>
+            </w:r>
+          </w:p>
+        </w:tc>
+      </w:tr>
+      <w:tr>
+        <w:tc>
+          <w:tcPr>
+            <w:tcW w:type="dxa" w:w="4320"/>
+          </w:tcPr>
+          <w:p>
+            <w:r>
+              <w:t>Less than 100%</w:t>
+            </w:r>
+          </w:p>
+        </w:tc>
+        <w:tc>
+          <w:tcPr>
+            <w:tcW w:type="dxa" w:w="4320"/>
+          </w:tcPr>
+          <w:p>
+            <w:pPr>
+              <w:jc w:val="right"/>
+            </w:pPr>
+            <w:r>
+              <w:t>16,620,007.6</w:t>
+            </w:r>
+          </w:p>
+        </w:tc>
+      </w:tr>
+      <w:tr>
+        <w:tc>
+          <w:tcPr>
+            <w:tcW w:type="dxa" w:w="4320"/>
+          </w:tcPr>
+          <w:p>
+            <w:r>
+              <w:t>100%</w:t>
+            </w:r>
+          </w:p>
+        </w:tc>
+        <w:tc>
+          <w:tcPr>
+            <w:tcW w:type="dxa" w:w="4320"/>
+          </w:tcPr>
+          <w:p>
+            <w:pPr>
+              <w:jc w:val="right"/>
+            </w:pPr>
+            <w:r>
+              <w:t>7,531,996.0</w:t>
+            </w:r>
+          </w:p>
+        </w:tc>
+      </w:tr>
+      <w:tr>
+        <w:tc>
+          <w:tcPr>
+            <w:tcW w:type="dxa" w:w="4320"/>
+          </w:tcPr>
+          <w:p>
+            <w:r>
+              <w:t>More than 100%</w:t>
+            </w:r>
+          </w:p>
+        </w:tc>
+        <w:tc>
+          <w:tcPr>
+            <w:tcW w:type="dxa" w:w="4320"/>
+          </w:tcPr>
+          <w:p>
+            <w:pPr>
+              <w:jc w:val="right"/>
+            </w:pPr>
+            <w:r>
+              <w:t>7,761,643.2</w:t>
+            </w:r>
+          </w:p>
+        </w:tc>
+      </w:tr>
+      <w:tr>
+        <w:tc>
+          <w:tcPr>
+            <w:tcW w:type="dxa" w:w="4320"/>
+          </w:tcPr>
+          <w:p>
+            <w:r>
+              <w:t>Total</w:t>
+            </w:r>
+          </w:p>
+        </w:tc>
+        <w:tc>
+          <w:tcPr>
+            <w:tcW w:type="dxa" w:w="4320"/>
+          </w:tcPr>
+          <w:p>
+            <w:pPr>
+              <w:jc w:val="right"/>
+            </w:pPr>
+            <w:r>
+              <w:t>31,913,646.8</w:t>
+            </w:r>
+          </w:p>
+        </w:tc>
+      </w:tr>
+    </w:tbl>
+    <w:p/>
+    <w:p>
+      <w:pPr>
+        <w:pStyle w:val="Title"/>
+      </w:pPr>
+      <w:r>
+        <w:t>Table DF-5: Credit Risk Mitigation: Standardised Approach</w:t>
+      </w:r>
+    </w:p>
+    <w:p>
+      <w:r>
+        <w:rPr>
+          <w:b/>
+        </w:rPr>
+        <w:t>ICICI Bank Limited (consolidated)  |  31 March 2025  |  INR million</w:t>
+      </w:r>
+    </w:p>
+    <w:p>
+      <w:r>
+        <w:rPr>
+          <w:i/>
+          <w:sz w:val="18"/>
+        </w:rPr>
+        <w:t>Source: ICICI Bank, Basel III Pillar 3 Disclosures at March 31, 2025 (76 pages), pages 29-31. Data status: not_in_data.</w:t>
+      </w:r>
+    </w:p>
+    <w:p>
+      <w:r>
+        <w:rPr>
+          <w:b w:val="0"/>
+          <w:i/>
+        </w:rPr>
+        <w:t>This table is not populated. bank_data.json carries no figures for DF-5. The disclosure text and figures must be taken from the bank's PDF, pages 29-31, before this file can be filed.</w:t>
+      </w:r>
+    </w:p>
+    <w:p>
+      <w:pPr>
+        <w:pStyle w:val="Title"/>
+      </w:pPr>
+      <w:r>
+        <w:t>Table DF-6: Securitisation Exposures: Standardised Approach</w:t>
+      </w:r>
+    </w:p>
+    <w:p>
+      <w:r>
+        <w:rPr>
+          <w:b/>
+        </w:rPr>
+        <w:t>ICICI Bank Limited (consolidated)  |  31 March 2025  |  INR million</w:t>
+      </w:r>
+    </w:p>
+    <w:p>
+      <w:r>
+        <w:rPr>
+          <w:i/>
+          <w:sz w:val="18"/>
+        </w:rPr>
+        <w:t>Source: ICICI Bank, Basel III Pillar 3 Disclosures at March 31, 2025 (76 pages), pages 32-38. Data status: partial.</w:t>
+      </w:r>
+    </w:p>
+    <w:p>
+      <w:r>
+        <w:rPr>
+          <w:b/>
+          <w:i w:val="0"/>
+        </w:rPr>
+        <w:t>Capital required for securitisation exposures under the standardised approach</w:t>
+      </w:r>
+    </w:p>
+    <w:tbl>
+      <w:tblPr>
+        <w:tblStyle w:val="LightGrid-Accent1"/>
+        <w:tblW w:type="auto" w:w="0"/>
+        <w:tblLook w:firstColumn="1" w:firstRow="1" w:lastColumn="0" w:lastRow="0" w:noHBand="0" w:noVBand="1" w:val="04A0"/>
+      </w:tblPr>
+      <w:tblGrid>
+        <w:gridCol w:w="4320"/>
+        <w:gridCol w:w="4320"/>
+      </w:tblGrid>
+      <w:tr>
+        <w:tc>
+          <w:tcPr>
+            <w:tcW w:type="dxa" w:w="4320"/>
+          </w:tcPr>
+          <w:p>
+            <w:r/>
+            <w:r>
+              <w:rPr>
+                <w:b/>
+              </w:rPr>
+              <w:t>Item</w:t>
+            </w:r>
+          </w:p>
+        </w:tc>
+        <w:tc>
+          <w:tcPr>
+            <w:tcW w:type="dxa" w:w="4320"/>
+          </w:tcPr>
+          <w:p>
+            <w:r/>
+            <w:r>
+              <w:rPr>
+                <w:b/>
+              </w:rPr>
+              <w:t>Amount</w:t>
+            </w:r>
+          </w:p>
+        </w:tc>
+      </w:tr>
+      <w:tr>
+        <w:tc>
+          <w:tcPr>
+            <w:tcW w:type="dxa" w:w="4320"/>
+          </w:tcPr>
+          <w:p>
+            <w:r>
+              <w:t>Capital required, securitisation</w:t>
+            </w:r>
+          </w:p>
+        </w:tc>
+        <w:tc>
+          <w:tcPr>
+            <w:tcW w:type="dxa" w:w="4320"/>
+          </w:tcPr>
+          <w:p>
+            <w:pPr>
+              <w:jc w:val="right"/>
+            </w:pPr>
+            <w:r>
+              <w:t>6,220.4</w:t>
+            </w:r>
+          </w:p>
+        </w:tc>
+      </w:tr>
+    </w:tbl>
+    <w:p/>
+    <w:p>
+      <w:r>
+        <w:rPr>
+          <w:b w:val="0"/>
+          <w:i/>
+        </w:rPr>
+        <w:t>The exposure-level breakdown on pages 32-38 is not in bank_data.json.</w:t>
+      </w:r>
+    </w:p>
+    <w:p>
+      <w:pPr>
+        <w:pStyle w:val="Title"/>
+      </w:pPr>
+      <w:r>
+        <w:t>Table DF-7: Market Risk in Trading Book</w:t>
+      </w:r>
+    </w:p>
+    <w:p>
+      <w:r>
+        <w:rPr>
+          <w:b/>
+        </w:rPr>
+        <w:t>ICICI Bank Limited (consolidated)  |  31 March 2025  |  INR million</w:t>
+      </w:r>
+    </w:p>
+    <w:p>
+      <w:r>
+        <w:rPr>
+          <w:i/>
+          <w:sz w:val="18"/>
+        </w:rPr>
+        <w:t>Source: ICICI Bank, Basel III Pillar 3 Disclosures at March 31, 2025 (76 pages), pages 39-42. Data status: complete.</w:t>
+      </w:r>
+    </w:p>
+    <w:p>
+      <w:r>
+        <w:rPr>
+          <w:b w:val="0"/>
+          <w:i w:val="0"/>
+        </w:rPr>
+        <w:t>Approach: Standardised duration approach.</w:t>
+      </w:r>
+    </w:p>
+    <w:tbl>
+      <w:tblPr>
+        <w:tblStyle w:val="LightGrid-Accent1"/>
+        <w:tblW w:type="auto" w:w="0"/>
+        <w:tblLook w:firstColumn="1" w:firstRow="1" w:lastColumn="0" w:lastRow="0" w:noHBand="0" w:noVBand="1" w:val="04A0"/>
+      </w:tblPr>
+      <w:tblGrid>
+        <w:gridCol w:w="4320"/>
+        <w:gridCol w:w="4320"/>
+      </w:tblGrid>
+      <w:tr>
+        <w:tc>
+          <w:tcPr>
+            <w:tcW w:type="dxa" w:w="4320"/>
+          </w:tcPr>
+          <w:p>
+            <w:r/>
+            <w:r>
+              <w:rPr>
+                <w:b/>
+              </w:rPr>
+              <w:t>Risk</w:t>
+            </w:r>
+          </w:p>
+        </w:tc>
+        <w:tc>
+          <w:tcPr>
+            <w:tcW w:type="dxa" w:w="4320"/>
+          </w:tcPr>
+          <w:p>
+            <w:r/>
+            <w:r>
+              <w:rPr>
+                <w:b/>
+              </w:rPr>
+              <w:t>Capital required</w:t>
+            </w:r>
+          </w:p>
+        </w:tc>
+      </w:tr>
+      <w:tr>
+        <w:tc>
+          <w:tcPr>
+            <w:tcW w:type="dxa" w:w="4320"/>
+          </w:tcPr>
+          <w:p>
+            <w:r>
+              <w:t>Interest rate risk</w:t>
+            </w:r>
+          </w:p>
+        </w:tc>
+        <w:tc>
+          <w:tcPr>
+            <w:tcW w:type="dxa" w:w="4320"/>
+          </w:tcPr>
+          <w:p>
+            <w:pPr>
+              <w:jc w:val="right"/>
+            </w:pPr>
+            <w:r>
+              <w:t>84,672.3</w:t>
+            </w:r>
+          </w:p>
+        </w:tc>
+      </w:tr>
+      <w:tr>
+        <w:tc>
+          <w:tcPr>
+            <w:tcW w:type="dxa" w:w="4320"/>
+          </w:tcPr>
+          <w:p>
+            <w:r>
+              <w:t>Foreign exchange risk, including gold</w:t>
+            </w:r>
+          </w:p>
+        </w:tc>
+        <w:tc>
+          <w:tcPr>
+            <w:tcW w:type="dxa" w:w="4320"/>
+          </w:tcPr>
+          <w:p>
+            <w:pPr>
+              <w:jc w:val="right"/>
+            </w:pPr>
+            <w:r>
+              <w:t>3,892.0</w:t>
+            </w:r>
+          </w:p>
+        </w:tc>
+      </w:tr>
+      <w:tr>
+        <w:tc>
+          <w:tcPr>
+            <w:tcW w:type="dxa" w:w="4320"/>
+          </w:tcPr>
+          <w:p>
+            <w:r>
+              <w:t>Equity position risk</w:t>
+            </w:r>
+          </w:p>
+        </w:tc>
+        <w:tc>
+          <w:tcPr>
+            <w:tcW w:type="dxa" w:w="4320"/>
+          </w:tcPr>
+          <w:p>
+            <w:pPr>
+              <w:jc w:val="right"/>
+            </w:pPr>
+            <w:r>
+              <w:t>4,467.8</w:t>
+            </w:r>
+          </w:p>
+        </w:tc>
+      </w:tr>
+      <w:tr>
+        <w:tc>
+          <w:tcPr>
+            <w:tcW w:type="dxa" w:w="4320"/>
+          </w:tcPr>
+          <w:p>
+            <w:r>
+              <w:t>Total</w:t>
+            </w:r>
+          </w:p>
+        </w:tc>
+        <w:tc>
+          <w:tcPr>
+            <w:tcW w:type="dxa" w:w="4320"/>
+          </w:tcPr>
+          <w:p>
+            <w:pPr>
+              <w:jc w:val="right"/>
+            </w:pPr>
+            <w:r>
+              <w:t>93,032.1</w:t>
+            </w:r>
+          </w:p>
+        </w:tc>
+      </w:tr>
+    </w:tbl>
+    <w:p/>
+    <w:p>
+      <w:pPr>
+        <w:pStyle w:val="Title"/>
+      </w:pPr>
+      <w:r>
+        <w:t>Table DF-8: Operational Risk</w:t>
+      </w:r>
+    </w:p>
+    <w:p>
+      <w:r>
+        <w:rPr>
+          <w:b/>
+        </w:rPr>
+        <w:t>ICICI Bank Limited (consolidated)  |  31 March 2025  |  INR million</w:t>
+      </w:r>
+    </w:p>
+    <w:p>
+      <w:r>
+        <w:rPr>
+          <w:i/>
+          <w:sz w:val="18"/>
+        </w:rPr>
+        <w:t>Source: ICICI Bank, Basel III Pillar 3 Disclosures at March 31, 2025 (76 pages), pages 43-46. Data status: complete.</w:t>
+      </w:r>
+    </w:p>
+    <w:p>
+      <w:r>
+        <w:rPr>
+          <w:b w:val="0"/>
+          <w:i w:val="0"/>
+        </w:rPr>
+        <w:t>Approach: Basic Indicator Approach.</w:t>
+      </w:r>
+    </w:p>
+    <w:tbl>
+      <w:tblPr>
+        <w:tblStyle w:val="LightGrid-Accent1"/>
+        <w:tblW w:type="auto" w:w="0"/>
+        <w:tblLook w:firstColumn="1" w:firstRow="1" w:lastColumn="0" w:lastRow="0" w:noHBand="0" w:noVBand="1" w:val="04A0"/>
+      </w:tblPr>
+      <w:tblGrid>
+        <w:gridCol w:w="4320"/>
+        <w:gridCol w:w="4320"/>
+      </w:tblGrid>
+      <w:tr>
+        <w:tc>
+          <w:tcPr>
+            <w:tcW w:type="dxa" w:w="4320"/>
+          </w:tcPr>
+          <w:p>
+            <w:r/>
+            <w:r>
+              <w:rPr>
+                <w:b/>
+              </w:rPr>
+              <w:t>Item</w:t>
+            </w:r>
+          </w:p>
+        </w:tc>
+        <w:tc>
+          <w:tcPr>
+            <w:tcW w:type="dxa" w:w="4320"/>
+          </w:tcPr>
+          <w:p>
+            <w:r/>
+            <w:r>
+              <w:rPr>
+                <w:b/>
+              </w:rPr>
+              <w:t>Amount</w:t>
+            </w:r>
+          </w:p>
+        </w:tc>
+      </w:tr>
+      <w:tr>
+        <w:tc>
+          <w:tcPr>
+            <w:tcW w:type="dxa" w:w="4320"/>
+          </w:tcPr>
+          <w:p>
+            <w:r>
+              <w:t>Capital required for operational risk</w:t>
+            </w:r>
+          </w:p>
+        </w:tc>
+        <w:tc>
+          <w:tcPr>
+            <w:tcW w:type="dxa" w:w="4320"/>
+          </w:tcPr>
+          <w:p>
+            <w:pPr>
+              <w:jc w:val="right"/>
+            </w:pPr>
+            <w:r>
+              <w:t>193,394.3</w:t>
+            </w:r>
+          </w:p>
+        </w:tc>
+      </w:tr>
+    </w:tbl>
+    <w:p/>
+    <w:p>
+      <w:pPr>
+        <w:pStyle w:val="Title"/>
+      </w:pPr>
+      <w:r>
+        <w:t>Table DF-9: Interest Rate Risk in the Banking Book (IRRBB)</w:t>
+      </w:r>
+    </w:p>
+    <w:p>
+      <w:r>
+        <w:rPr>
+          <w:b/>
+        </w:rPr>
+        <w:t>ICICI Bank Limited (consolidated)  |  31 March 2025  |  INR million</w:t>
+      </w:r>
+    </w:p>
+    <w:p>
+      <w:r>
+        <w:rPr>
+          <w:i/>
+          <w:sz w:val="18"/>
+        </w:rPr>
+        <w:t>Source: ICICI Bank, Basel III Pillar 3 Disclosures at March 31, 2025 (76 pages), pages 47-54. Data status: complete.</w:t>
+      </w:r>
+    </w:p>
+    <w:p>
+      <w:r>
+        <w:rPr>
+          <w:b w:val="0"/>
+          <w:i w:val="0"/>
+        </w:rPr>
+        <w:t>Impact of a 100 bps downward parallel shift in interest rates. Impact of a 100 bps downward parallel shift; the upward shift is the mirror image (p51).</w:t>
+      </w:r>
+    </w:p>
+    <w:tbl>
+      <w:tblPr>
+        <w:tblStyle w:val="LightGrid-Accent1"/>
+        <w:tblW w:type="auto" w:w="0"/>
+        <w:tblLook w:firstColumn="1" w:firstRow="1" w:lastColumn="0" w:lastRow="0" w:noHBand="0" w:noVBand="1" w:val="04A0"/>
+      </w:tblPr>
+      <w:tblGrid>
+        <w:gridCol w:w="2880"/>
+        <w:gridCol w:w="2880"/>
+        <w:gridCol w:w="2880"/>
+      </w:tblGrid>
+      <w:tr>
+        <w:tc>
+          <w:tcPr>
+            <w:tcW w:type="dxa" w:w="2880"/>
+          </w:tcPr>
+          <w:p>
+            <w:r/>
+            <w:r>
+              <w:rPr>
+                <w:b/>
+              </w:rPr>
+              <w:t>Currency</w:t>
+            </w:r>
+          </w:p>
+        </w:tc>
+        <w:tc>
+          <w:tcPr>
+            <w:tcW w:type="dxa" w:w="2880"/>
+          </w:tcPr>
+          <w:p>
+            <w:r/>
+            <w:r>
+              <w:rPr>
+                <w:b/>
+              </w:rPr>
+              <w:t>Earnings (NII) impact</w:t>
+            </w:r>
+          </w:p>
+        </w:tc>
+        <w:tc>
+          <w:tcPr>
+            <w:tcW w:type="dxa" w:w="2880"/>
+          </w:tcPr>
+          <w:p>
+            <w:r/>
+            <w:r>
+              <w:rPr>
+                <w:b/>
+              </w:rPr>
+              <w:t>Economic value (EVE) impact</w:t>
+            </w:r>
+          </w:p>
+        </w:tc>
+      </w:tr>
+      <w:tr>
+        <w:tc>
+          <w:tcPr>
+            <w:tcW w:type="dxa" w:w="2880"/>
+          </w:tcPr>
+          <w:p>
+            <w:r>
+              <w:t>INR</w:t>
+            </w:r>
+          </w:p>
+        </w:tc>
+        <w:tc>
+          <w:tcPr>
+            <w:tcW w:type="dxa" w:w="2880"/>
+          </w:tcPr>
+          <w:p>
+            <w:pPr>
+              <w:jc w:val="right"/>
+            </w:pPr>
+            <w:r>
+              <w:t>-41,450.2</w:t>
+            </w:r>
+          </w:p>
+        </w:tc>
+        <w:tc>
+          <w:tcPr>
+            <w:tcW w:type="dxa" w:w="2880"/>
+          </w:tcPr>
+          <w:p>
+            <w:pPr>
+              <w:jc w:val="right"/>
+            </w:pPr>
+            <w:r>
+              <w:t>56,963.2</w:t>
+            </w:r>
+          </w:p>
+        </w:tc>
+      </w:tr>
+      <w:tr>
+        <w:tc>
+          <w:tcPr>
+            <w:tcW w:type="dxa" w:w="2880"/>
+          </w:tcPr>
+          <w:p>
+            <w:r>
+              <w:t>USD</w:t>
+            </w:r>
+          </w:p>
+        </w:tc>
+        <w:tc>
+          <w:tcPr>
+            <w:tcW w:type="dxa" w:w="2880"/>
+          </w:tcPr>
+          <w:p>
+            <w:pPr>
+              <w:jc w:val="right"/>
+            </w:pPr>
+            <w:r>
+              <w:t>-2,749.5</w:t>
+            </w:r>
+          </w:p>
+        </w:tc>
+        <w:tc>
+          <w:tcPr>
+            <w:tcW w:type="dxa" w:w="2880"/>
+          </w:tcPr>
+          <w:p>
+            <w:pPr>
+              <w:jc w:val="right"/>
+            </w:pPr>
+            <w:r>
+              <w:t>-1,386.1</w:t>
+            </w:r>
+          </w:p>
+        </w:tc>
+      </w:tr>
+      <w:tr>
+        <w:tc>
+          <w:tcPr>
+            <w:tcW w:type="dxa" w:w="2880"/>
+          </w:tcPr>
+          <w:p>
+            <w:r>
+              <w:t>Others</w:t>
+            </w:r>
+          </w:p>
+        </w:tc>
+        <w:tc>
+          <w:tcPr>
+            <w:tcW w:type="dxa" w:w="2880"/>
+          </w:tcPr>
+          <w:p>
+            <w:pPr>
+              <w:jc w:val="right"/>
+            </w:pPr>
+            <w:r>
+              <w:t>-1,130.7</w:t>
+            </w:r>
+          </w:p>
+        </w:tc>
+        <w:tc>
+          <w:tcPr>
+            <w:tcW w:type="dxa" w:w="2880"/>
+          </w:tcPr>
+          <w:p>
+            <w:pPr>
+              <w:jc w:val="right"/>
+            </w:pPr>
+            <w:r>
+              <w:t>-337.5</w:t>
+            </w:r>
+          </w:p>
+        </w:tc>
+      </w:tr>
+      <w:tr>
+        <w:tc>
+          <w:tcPr>
+            <w:tcW w:type="dxa" w:w="2880"/>
+          </w:tcPr>
+          <w:p>
+            <w:r>
+              <w:t>Total</w:t>
+            </w:r>
+          </w:p>
+        </w:tc>
+        <w:tc>
+          <w:tcPr>
+            <w:tcW w:type="dxa" w:w="2880"/>
+          </w:tcPr>
+          <w:p>
+            <w:pPr>
+              <w:jc w:val="right"/>
+            </w:pPr>
+            <w:r>
+              <w:t>-45,330.4</w:t>
+            </w:r>
+          </w:p>
+        </w:tc>
+        <w:tc>
+          <w:tcPr>
+            <w:tcW w:type="dxa" w:w="2880"/>
+          </w:tcPr>
+          <w:p>
+            <w:pPr>
+              <w:jc w:val="right"/>
+            </w:pPr>
+            <w:r>
+              <w:t>55,239.6</w:t>
+            </w:r>
+          </w:p>
+        </w:tc>
+      </w:tr>
+    </w:tbl>
+    <w:p/>
+    <w:p>
+      <w:pPr>
+        <w:pStyle w:val="Title"/>
+      </w:pPr>
+      <w:r>
+        <w:t>Table DF-10: General Disclosure for Exposures Related to Counterparty Credit Risk</w:t>
+      </w:r>
+    </w:p>
+    <w:p>
+      <w:r>
+        <w:rPr>
+          <w:b/>
+        </w:rPr>
+        <w:t>ICICI Bank Limited (consolidated)  |  31 March 2025  |  INR million</w:t>
+      </w:r>
+    </w:p>
+    <w:p>
+      <w:r>
+        <w:rPr>
+          <w:i/>
+          <w:sz w:val="18"/>
+        </w:rPr>
+        <w:t>Source: ICICI Bank, Basel III Pillar 3 Disclosures at March 31, 2025 (76 pages), pages 55-63. Data status: not_in_data.</w:t>
+      </w:r>
+    </w:p>
+    <w:p>
+      <w:r>
+        <w:rPr>
+          <w:b w:val="0"/>
+          <w:i/>
+        </w:rPr>
+        <w:t>This table is not populated. bank_data.json carries no figures for DF-10. The disclosure text and figures must be taken from the bank's PDF, pages 55-63, before this file can be filed.</w:t>
+      </w:r>
+    </w:p>
+    <w:p>
+      <w:pPr>
+        <w:pStyle w:val="Title"/>
+      </w:pPr>
+      <w:r>
+        <w:t>Table DF-11: Composition of Capital</w:t>
+      </w:r>
+    </w:p>
+    <w:p>
+      <w:r>
+        <w:rPr>
+          <w:b/>
+        </w:rPr>
+        <w:t>ICICI Bank Limited (consolidated)  |  31 March 2025  |  INR million</w:t>
+      </w:r>
+    </w:p>
+    <w:p>
+      <w:r>
+        <w:rPr>
+          <w:i/>
+          <w:sz w:val="18"/>
+        </w:rPr>
+        <w:t>Source: ICICI Bank, Basel III Pillar 3 Disclosures at March 31, 2025 (76 pages), pages separate annexure. Data status: not_in_data.</w:t>
+      </w:r>
+    </w:p>
+    <w:p>
+      <w:r>
+        <w:rPr>
+          <w:b w:val="0"/>
+          <w:i/>
+        </w:rPr>
+        <w:t>This table is not populated. bank_data.json carries no figures for DF-11. The disclosure text and figures must be taken from the bank's PDF, pages separate annexure, before this file can be filed.</w:t>
+      </w:r>
+    </w:p>
+    <w:p>
+      <w:pPr>
+        <w:pStyle w:val="Title"/>
+      </w:pPr>
+      <w:r>
+        <w:t>Table DF-12: Composition of Capital: Reconciliation Requirements</w:t>
+      </w:r>
+    </w:p>
+    <w:p>
+      <w:r>
+        <w:rPr>
+          <w:b/>
+        </w:rPr>
+        <w:t>ICICI Bank Limited (consolidated)  |  31 March 2025  |  INR million</w:t>
+      </w:r>
+    </w:p>
+    <w:p>
+      <w:r>
+        <w:rPr>
+          <w:i/>
+          <w:sz w:val="18"/>
+        </w:rPr>
+        <w:t>Source: ICICI Bank, Basel III Pillar 3 Disclosures at March 31, 2025 (76 pages), pages separate annexure. Data status: not_in_data.</w:t>
+      </w:r>
+    </w:p>
+    <w:p>
+      <w:r>
+        <w:rPr>
+          <w:b w:val="0"/>
+          <w:i/>
+        </w:rPr>
+        <w:t>This table is not populated. bank_data.json carries no figures for DF-12. The disclosure text and figures must be taken from the bank's PDF, pages separate annexure, before this file can be filed.</w:t>
+      </w:r>
+    </w:p>
+    <w:p>
+      <w:pPr>
+        <w:pStyle w:val="Title"/>
+      </w:pPr>
+      <w:r>
+        <w:t>Table DF-13: Main Features of Regulatory Capital Instruments</w:t>
+      </w:r>
+    </w:p>
+    <w:p>
+      <w:r>
+        <w:rPr>
+          <w:b/>
+        </w:rPr>
+        <w:t>ICICI Bank Limited (consolidated)  |  31 March 2025  |  INR million</w:t>
+      </w:r>
+    </w:p>
+    <w:p>
+      <w:r>
+        <w:rPr>
+          <w:i/>
+          <w:sz w:val="18"/>
+        </w:rPr>
+        <w:t>Source: ICICI Bank, Basel III Pillar 3 Disclosures at March 31, 2025 (76 pages), pages separate annexure. Data status: not_in_data.</w:t>
+      </w:r>
+    </w:p>
+    <w:p>
+      <w:r>
+        <w:rPr>
+          <w:b w:val="0"/>
+          <w:i/>
+        </w:rPr>
+        <w:t>This table is not populated. bank_data.json carries no figures for DF-13. The disclosure text and figures must be taken from the bank's PDF, pages separate annexure, before this file can be filed.</w:t>
+      </w:r>
+    </w:p>
+    <w:p>
+      <w:pPr>
+        <w:pStyle w:val="Title"/>
+      </w:pPr>
+      <w:r>
+        <w:t>Table DF-14: Full Terms and Conditions of Regulatory Capital Instruments</w:t>
+      </w:r>
+    </w:p>
+    <w:p>
+      <w:r>
+        <w:rPr>
+          <w:b/>
+        </w:rPr>
+        <w:t>ICICI Bank Limited (consolidated)  |  31 March 2025  |  INR million</w:t>
+      </w:r>
+    </w:p>
+    <w:p>
+      <w:r>
+        <w:rPr>
+          <w:i/>
+          <w:sz w:val="18"/>
+        </w:rPr>
+        <w:t>Source: ICICI Bank, Basel III Pillar 3 Disclosures at March 31, 2025 (76 pages), pages separate annexure. Data status: not_in_data.</w:t>
+      </w:r>
+    </w:p>
+    <w:p>
+      <w:r>
+        <w:rPr>
+          <w:b w:val="0"/>
+          <w:i/>
+        </w:rPr>
+        <w:t>This table is not populated. bank_data.json carries no figures for DF-14. The disclosure text and figures must be taken from the bank's PDF, pages separate annexure, before this file can be filed.</w:t>
+      </w:r>
+    </w:p>
+    <w:p>
+      <w:pPr>
+        <w:pStyle w:val="Title"/>
+      </w:pPr>
+      <w:r>
+        <w:t>Table DF-15: Disclosure Requirements for Remuneration</w:t>
+      </w:r>
+    </w:p>
+    <w:p>
+      <w:r>
+        <w:rPr>
+          <w:b/>
+        </w:rPr>
+        <w:t>ICICI Bank Limited (consolidated)  |  31 March 2025  |  INR million</w:t>
+      </w:r>
+    </w:p>
+    <w:p>
+      <w:r>
+        <w:rPr>
+          <w:i/>
+          <w:sz w:val="18"/>
+        </w:rPr>
+        <w:t>Source: ICICI Bank, Basel III Pillar 3 Disclosures at March 31, 2025 (76 pages), pages 64-72. Data status: not_in_data.</w:t>
+      </w:r>
+    </w:p>
+    <w:p>
+      <w:r>
+        <w:rPr>
+          <w:b w:val="0"/>
+          <w:i/>
+        </w:rPr>
+        <w:t>This table is not populated. bank_data.json carries no figures for DF-15. The disclosure text and figures must be taken from the bank's PDF, pages 64-72, before this file can be filed.</w:t>
+      </w:r>
+    </w:p>
+    <w:p>
+      <w:pPr>
+        <w:pStyle w:val="Title"/>
+      </w:pPr>
+      <w:r>
+        <w:t>Table DF-16: Equities: Disclosure for Banking Book Positions</w:t>
+      </w:r>
+    </w:p>
+    <w:p>
+      <w:r>
+        <w:rPr>
+          <w:b/>
+        </w:rPr>
+        <w:t>ICICI Bank Limited (consolidated)  |  31 March 2025  |  INR million</w:t>
+      </w:r>
+    </w:p>
+    <w:p>
+      <w:r>
+        <w:rPr>
+          <w:i/>
+          <w:sz w:val="18"/>
+        </w:rPr>
+        <w:t>Source: ICICI Bank, Basel III Pillar 3 Disclosures at March 31, 2025 (76 pages), pages 73. Data status: complete.</w:t>
+      </w:r>
+    </w:p>
+    <w:tbl>
+      <w:tblPr>
+        <w:tblStyle w:val="LightGrid-Accent1"/>
+        <w:tblW w:type="auto" w:w="0"/>
+        <w:tblLook w:firstColumn="1" w:firstRow="1" w:lastColumn="0" w:lastRow="0" w:noHBand="0" w:noVBand="1" w:val="04A0"/>
+      </w:tblPr>
+      <w:tblGrid>
+        <w:gridCol w:w="4320"/>
+        <w:gridCol w:w="4320"/>
+      </w:tblGrid>
+      <w:tr>
+        <w:tc>
+          <w:tcPr>
+            <w:tcW w:type="dxa" w:w="4320"/>
+          </w:tcPr>
+          <w:p>
+            <w:r/>
+            <w:r>
+              <w:rPr>
+                <w:b/>
+              </w:rPr>
+              <w:t>Item</w:t>
+            </w:r>
+          </w:p>
+        </w:tc>
+        <w:tc>
+          <w:tcPr>
+            <w:tcW w:type="dxa" w:w="4320"/>
+          </w:tcPr>
+          <w:p>
+            <w:r/>
+            <w:r>
+              <w:rPr>
+                <w:b/>
+              </w:rPr>
+              <w:t>Amount</w:t>
+            </w:r>
+          </w:p>
+        </w:tc>
+      </w:tr>
+      <w:tr>
+        <w:tc>
+          <w:tcPr>
+            <w:tcW w:type="dxa" w:w="4320"/>
+          </w:tcPr>
+          <w:p>
+            <w:r>
+              <w:t>Book value of banking-book equity investments</w:t>
+            </w:r>
+          </w:p>
+        </w:tc>
+        <w:tc>
+          <w:tcPr>
+            <w:tcW w:type="dxa" w:w="4320"/>
+          </w:tcPr>
+          <w:p>
+            <w:pPr>
+              <w:jc w:val="right"/>
+            </w:pPr>
+            <w:r>
+              <w:t>122,720.1</w:t>
+            </w:r>
+          </w:p>
+        </w:tc>
+      </w:tr>
+      <w:tr>
+        <w:tc>
+          <w:tcPr>
+            <w:tcW w:type="dxa" w:w="4320"/>
+          </w:tcPr>
+          <w:p>
+            <w:r>
+              <w:t>Market value</w:t>
+            </w:r>
+          </w:p>
+        </w:tc>
+        <w:tc>
+          <w:tcPr>
+            <w:tcW w:type="dxa" w:w="4320"/>
+          </w:tcPr>
+          <w:p>
+            <w:pPr>
+              <w:jc w:val="right"/>
+            </w:pPr>
+            <w:r>
+              <w:t>937,399.8</w:t>
+            </w:r>
+          </w:p>
+        </w:tc>
+      </w:tr>
+      <w:tr>
+        <w:tc>
+          <w:tcPr>
+            <w:tcW w:type="dxa" w:w="4320"/>
+          </w:tcPr>
+          <w:p>
+            <w:r>
+              <w:t>Realised gain from sale in the period</w:t>
+            </w:r>
+          </w:p>
+        </w:tc>
+        <w:tc>
+          <w:tcPr>
+            <w:tcW w:type="dxa" w:w="4320"/>
+          </w:tcPr>
+          <w:p>
+            <w:pPr>
+              <w:jc w:val="right"/>
+            </w:pPr>
+            <w:r>
+              <w:t>2.1</w:t>
+            </w:r>
+          </w:p>
+        </w:tc>
+      </w:tr>
+      <w:tr>
+        <w:tc>
+          <w:tcPr>
+            <w:tcW w:type="dxa" w:w="4320"/>
+          </w:tcPr>
+          <w:p>
+            <w:r>
+              <w:t>Unrealised gain or loss</w:t>
+            </w:r>
+          </w:p>
+        </w:tc>
+        <w:tc>
+          <w:tcPr>
+            <w:tcW w:type="dxa" w:w="4320"/>
+          </w:tcPr>
+          <w:p>
+            <w:pPr>
+              <w:jc w:val="right"/>
+            </w:pPr>
+            <w:r>
+              <w:t>19,500.1</w:t>
+            </w:r>
+          </w:p>
+        </w:tc>
+      </w:tr>
+      <w:tr>
+        <w:tc>
+          <w:tcPr>
+            <w:tcW w:type="dxa" w:w="4320"/>
+          </w:tcPr>
+          <w:p>
+            <w:r>
+              <w:t>Latent revaluation gain</w:t>
+            </w:r>
+          </w:p>
+        </w:tc>
+        <w:tc>
+          <w:tcPr>
+            <w:tcW w:type="dxa" w:w="4320"/>
+          </w:tcPr>
+          <w:p>
+            <w:pPr>
+              <w:jc w:val="right"/>
+            </w:pPr>
+            <w:r>
+              <w:t>795,179.6</w:t>
+            </w:r>
+          </w:p>
+        </w:tc>
+      </w:tr>
+    </w:tbl>
+    <w:p/>
+    <w:p>
+      <w:pPr>
+        <w:pStyle w:val="Title"/>
+      </w:pPr>
+      <w:r>
+        <w:t>Table DF-17: Summary Comparison of Accounting Assets and Leverage Ratio Exposure</w:t>
+      </w:r>
+    </w:p>
+    <w:p>
+      <w:r>
+        <w:rPr>
+          <w:b/>
+        </w:rPr>
+        <w:t>ICICI Bank Limited (consolidated)  |  31 March 2025  |  INR million</w:t>
+      </w:r>
+    </w:p>
+    <w:p>
+      <w:r>
+        <w:rPr>
+          <w:i/>
+          <w:sz w:val="18"/>
+        </w:rPr>
+        <w:t>Source: ICICI Bank, Basel III Pillar 3 Disclosures at March 31, 2025 (76 pages), pages 74. Data status: complete.</w:t>
+      </w:r>
+    </w:p>
+    <w:tbl>
+      <w:tblPr>
+        <w:tblStyle w:val="LightGrid-Accent1"/>
+        <w:tblW w:type="auto" w:w="0"/>
+        <w:tblLook w:firstColumn="1" w:firstRow="1" w:lastColumn="0" w:lastRow="0" w:noHBand="0" w:noVBand="1" w:val="04A0"/>
+      </w:tblPr>
+      <w:tblGrid>
+        <w:gridCol w:w="4320"/>
+        <w:gridCol w:w="4320"/>
+      </w:tblGrid>
+      <w:tr>
+        <w:tc>
+          <w:tcPr>
+            <w:tcW w:type="dxa" w:w="4320"/>
+          </w:tcPr>
+          <w:p>
+            <w:r/>
+            <w:r>
+              <w:rPr>
+                <w:b/>
+              </w:rPr>
+              <w:t>Item</w:t>
+            </w:r>
+          </w:p>
+        </w:tc>
+        <w:tc>
+          <w:tcPr>
+            <w:tcW w:type="dxa" w:w="4320"/>
+          </w:tcPr>
+          <w:p>
+            <w:r/>
+            <w:r>
+              <w:rPr>
+                <w:b/>
+              </w:rPr>
+              <w:t>Amount</w:t>
+            </w:r>
+          </w:p>
+        </w:tc>
+      </w:tr>
+      <w:tr>
+        <w:tc>
+          <w:tcPr>
+            <w:tcW w:type="dxa" w:w="4320"/>
+          </w:tcPr>
+          <w:p>
+            <w:r>
+              <w:t>Total consolidated assets as per published financial statements</w:t>
+            </w:r>
+          </w:p>
+        </w:tc>
+        <w:tc>
+          <w:tcPr>
+            <w:tcW w:type="dxa" w:w="4320"/>
+          </w:tcPr>
+          <w:p>
+            <w:pPr>
+              <w:jc w:val="right"/>
+            </w:pPr>
+            <w:r>
+              <w:t>26,422,414.0</w:t>
+            </w:r>
+          </w:p>
+        </w:tc>
+      </w:tr>
+      <w:tr>
+        <w:tc>
+          <w:tcPr>
+            <w:tcW w:type="dxa" w:w="4320"/>
+          </w:tcPr>
+          <w:p>
+            <w:r>
+              <w:t>Adjustment for investments in banking, financial, insurance or commercial entities</w:t>
+            </w:r>
+          </w:p>
+        </w:tc>
+        <w:tc>
+          <w:tcPr>
+            <w:tcW w:type="dxa" w:w="4320"/>
+          </w:tcPr>
+          <w:p>
+            <w:pPr>
+              <w:jc w:val="right"/>
+            </w:pPr>
+            <w:r>
+              <w:t>-79,383.1</w:t>
+            </w:r>
+          </w:p>
+        </w:tc>
+      </w:tr>
+      <w:tr>
+        <w:tc>
+          <w:tcPr>
+            <w:tcW w:type="dxa" w:w="4320"/>
+          </w:tcPr>
+          <w:p>
+            <w:r>
+              <w:t>Adjustment for fiduciary assets</w:t>
+            </w:r>
+          </w:p>
+        </w:tc>
+        <w:tc>
+          <w:tcPr>
+            <w:tcW w:type="dxa" w:w="4320"/>
+          </w:tcPr>
+          <w:p>
+            <w:pPr>
+              <w:jc w:val="right"/>
+            </w:pPr>
+            <w:r>
+              <w:t>0.0</w:t>
+            </w:r>
+          </w:p>
+        </w:tc>
+      </w:tr>
+      <w:tr>
+        <w:tc>
+          <w:tcPr>
+            <w:tcW w:type="dxa" w:w="4320"/>
+          </w:tcPr>
+          <w:p>
+            <w:r>
+              <w:t>Adjustments for derivative financial instruments</w:t>
+            </w:r>
+          </w:p>
+        </w:tc>
+        <w:tc>
+          <w:tcPr>
+            <w:tcW w:type="dxa" w:w="4320"/>
+          </w:tcPr>
+          <w:p>
+            <w:pPr>
+              <w:jc w:val="right"/>
+            </w:pPr>
+            <w:r>
+              <w:t>631,804.2</w:t>
+            </w:r>
+          </w:p>
+        </w:tc>
+      </w:tr>
+      <w:tr>
+        <w:tc>
+          <w:tcPr>
+            <w:tcW w:type="dxa" w:w="4320"/>
+          </w:tcPr>
+          <w:p>
+            <w:r>
+              <w:t>Adjustment for securities financing transactions</w:t>
+            </w:r>
+          </w:p>
+        </w:tc>
+        <w:tc>
+          <w:tcPr>
+            <w:tcW w:type="dxa" w:w="4320"/>
+          </w:tcPr>
+          <w:p>
+            <w:pPr>
+              <w:jc w:val="right"/>
+            </w:pPr>
+            <w:r>
+              <w:t>4,203.1</w:t>
+            </w:r>
+          </w:p>
+        </w:tc>
+      </w:tr>
+      <w:tr>
+        <w:tc>
+          <w:tcPr>
+            <w:tcW w:type="dxa" w:w="4320"/>
+          </w:tcPr>
+          <w:p>
+            <w:r>
+              <w:t>Adjustment for off-balance sheet items</w:t>
+            </w:r>
+          </w:p>
+        </w:tc>
+        <w:tc>
+          <w:tcPr>
+            <w:tcW w:type="dxa" w:w="4320"/>
+          </w:tcPr>
+          <w:p>
+            <w:pPr>
+              <w:jc w:val="right"/>
+            </w:pPr>
+            <w:r>
+              <w:t>3,431,306.8</w:t>
+            </w:r>
+          </w:p>
+        </w:tc>
+      </w:tr>
+      <w:tr>
+        <w:tc>
+          <w:tcPr>
+            <w:tcW w:type="dxa" w:w="4320"/>
+          </w:tcPr>
+          <w:p>
+            <w:r>
+              <w:t>Other adjustments</w:t>
+            </w:r>
+          </w:p>
+        </w:tc>
+        <w:tc>
+          <w:tcPr>
+            <w:tcW w:type="dxa" w:w="4320"/>
+          </w:tcPr>
+          <w:p>
+            <w:pPr>
+              <w:jc w:val="right"/>
+            </w:pPr>
+            <w:r>
+              <w:t>-3,843,454.8</w:t>
+            </w:r>
+          </w:p>
+        </w:tc>
+      </w:tr>
+      <w:tr>
+        <w:tc>
+          <w:tcPr>
+            <w:tcW w:type="dxa" w:w="4320"/>
+          </w:tcPr>
+          <w:p>
+            <w:r>
+              <w:t>Leverage ratio exposure</w:t>
+            </w:r>
+          </w:p>
+        </w:tc>
+        <w:tc>
+          <w:tcPr>
+            <w:tcW w:type="dxa" w:w="4320"/>
+          </w:tcPr>
+          <w:p>
+            <w:pPr>
+              <w:jc w:val="right"/>
+            </w:pPr>
+            <w:r>
+              <w:t>26,566,890.2</w:t>
+            </w:r>
+          </w:p>
+        </w:tc>
+      </w:tr>
+    </w:tbl>
+    <w:p/>
+    <w:p>
+      <w:r>
+        <w:rPr>
+          <w:b w:val="0"/>
+          <w:i/>
+        </w:rPr>
+        <w:t>Check: the rows add to the leverage ratio exposure. Passed.</w:t>
+      </w:r>
+    </w:p>
+    <w:p>
+      <w:pPr>
+        <w:pStyle w:val="Title"/>
+      </w:pPr>
+      <w:r>
+        <w:t>Table DF-18: Leverage Ratio Common Disclosure Template</w:t>
+      </w:r>
+    </w:p>
+    <w:p>
+      <w:r>
+        <w:rPr>
+          <w:b/>
+        </w:rPr>
+        <w:t>ICICI Bank Limited (consolidated)  |  31 March 2025  |  INR million</w:t>
+      </w:r>
+    </w:p>
+    <w:p>
+      <w:r>
+        <w:rPr>
+          <w:i/>
+          <w:sz w:val="18"/>
+        </w:rPr>
+        <w:t>Source: ICICI Bank, Basel III Pillar 3 Disclosures at March 31, 2025 (76 pages), pages 74-76. Data status: complete.</w:t>
+      </w:r>
+    </w:p>
+    <w:tbl>
+      <w:tblPr>
+        <w:tblStyle w:val="LightGrid-Accent1"/>
+        <w:tblW w:type="auto" w:w="0"/>
+        <w:tblLook w:firstColumn="1" w:firstRow="1" w:lastColumn="0" w:lastRow="0" w:noHBand="0" w:noVBand="1" w:val="04A0"/>
+      </w:tblPr>
+      <w:tblGrid>
+        <w:gridCol w:w="4320"/>
+        <w:gridCol w:w="4320"/>
+      </w:tblGrid>
+      <w:tr>
+        <w:tc>
+          <w:tcPr>
+            <w:tcW w:type="dxa" w:w="4320"/>
+          </w:tcPr>
+          <w:p>
+            <w:r/>
+            <w:r>
+              <w:rPr>
+                <w:b/>
+              </w:rPr>
+              <w:t>Item</w:t>
+            </w:r>
+          </w:p>
+        </w:tc>
+        <w:tc>
+          <w:tcPr>
+            <w:tcW w:type="dxa" w:w="4320"/>
+          </w:tcPr>
+          <w:p>
+            <w:r/>
+            <w:r>
+              <w:rPr>
+                <w:b/>
+              </w:rPr>
+              <w:t>Amount</w:t>
+            </w:r>
+          </w:p>
+        </w:tc>
+      </w:tr>
+      <w:tr>
+        <w:tc>
+          <w:tcPr>
+            <w:tcW w:type="dxa" w:w="4320"/>
+          </w:tcPr>
+          <w:p>
+            <w:r>
+              <w:t>On-balance sheet items, excluding derivatives and SFTs</w:t>
+            </w:r>
+          </w:p>
+        </w:tc>
+        <w:tc>
+          <w:tcPr>
+            <w:tcW w:type="dxa" w:w="4320"/>
+          </w:tcPr>
+          <w:p>
+            <w:pPr>
+              <w:jc w:val="right"/>
+            </w:pPr>
+            <w:r>
+              <w:t>22,334,576.7</w:t>
+            </w:r>
+          </w:p>
+        </w:tc>
+      </w:tr>
+      <w:tr>
+        <w:tc>
+          <w:tcPr>
+            <w:tcW w:type="dxa" w:w="4320"/>
+          </w:tcPr>
+          <w:p>
+            <w:r>
+              <w:t>Asset amounts deducted in determining Tier 1 capital</w:t>
+            </w:r>
+          </w:p>
+        </w:tc>
+        <w:tc>
+          <w:tcPr>
+            <w:tcW w:type="dxa" w:w="4320"/>
+          </w:tcPr>
+          <w:p>
+            <w:pPr>
+              <w:jc w:val="right"/>
+            </w:pPr>
+            <w:r>
+              <w:t>-150,520.1</w:t>
+            </w:r>
+          </w:p>
+        </w:tc>
+      </w:tr>
+      <w:tr>
+        <w:tc>
+          <w:tcPr>
+            <w:tcW w:type="dxa" w:w="4320"/>
+          </w:tcPr>
+          <w:p>
+            <w:r>
+              <w:t>Total on-balance sheet exposures</w:t>
             </w:r>
           </w:p>
         </w:tc>
@@ -788,7 +3353,7 @@
           </w:tcPr>
           <w:p>
             <w:r>
-              <w:t>Derivative exposures</w:t>
+              <w:t>Total derivative exposures</w:t>
             </w:r>
           </w:p>
         </w:tc>
@@ -813,7 +3378,7 @@
           </w:tcPr>
           <w:p>
             <w:r>
-              <w:t>Securities financing transaction exposures</w:t>
+              <w:t>Total securities financing transaction exposures</w:t>
             </w:r>
           </w:p>
         </w:tc>
@@ -913,7 +3478,7 @@
           </w:tcPr>
           <w:p>
             <w:r>
-              <w:t>Basel III leverage ratio</w:t>
+              <w:t>Basel III leverage ratio, computed</w:t>
             </w:r>
           </w:p>
         </w:tc>
@@ -938,7 +3503,32 @@
           </w:tcPr>
           <w:p>
             <w:r>
-              <w:t>RBI minimum (D-SIB)</w:t>
+              <w:t>Basel III leverage ratio, published</w:t>
+            </w:r>
+          </w:p>
+        </w:tc>
+        <w:tc>
+          <w:tcPr>
+            <w:tcW w:type="dxa" w:w="4320"/>
+          </w:tcPr>
+          <w:p>
+            <w:pPr>
+              <w:jc w:val="right"/>
+            </w:pPr>
+            <w:r>
+              <w:t>10.37%</w:t>
+            </w:r>
+          </w:p>
+        </w:tc>
+      </w:tr>
+      <w:tr>
+        <w:tc>
+          <w:tcPr>
+            <w:tcW w:type="dxa" w:w="4320"/>
+          </w:tcPr>
+          <w:p>
+            <w:r>
+              <w:t>RBI minimum, D-SIB</w:t>
             </w:r>
           </w:p>
         </w:tc>
@@ -958,567 +3548,6 @@
       </w:tr>
     </w:tbl>
     <w:p/>
-    <w:p>
-      <w:pPr>
-        <w:pStyle w:val="Heading1"/>
-      </w:pPr>
-      <w:r>
-        <w:t>Liquidity: LCR and NSFR (illustrative inputs)</w:t>
-      </w:r>
-    </w:p>
-    <w:p>
-      <w:r>
-        <w:rPr>
-          <w:b w:val="0"/>
-          <w:i/>
-          <w:sz w:val="18"/>
-        </w:rPr>
-        <w:t>The inputs in this table are teaching values, not the bank's published figures. The bank discloses LCR and NSFR in its annual report and quarterly liquidity disclosures.</w:t>
-      </w:r>
-    </w:p>
-    <w:tbl>
-      <w:tblPr>
-        <w:tblStyle w:val="LightGrid-Accent1"/>
-        <w:tblW w:type="auto" w:w="0"/>
-        <w:tblLook w:firstColumn="1" w:firstRow="1" w:lastColumn="0" w:lastRow="0" w:noHBand="0" w:noVBand="1" w:val="04A0"/>
-      </w:tblPr>
-      <w:tblGrid>
-        <w:gridCol w:w="4320"/>
-        <w:gridCol w:w="4320"/>
-      </w:tblGrid>
-      <w:tr>
-        <w:tc>
-          <w:tcPr>
-            <w:tcW w:type="dxa" w:w="4320"/>
-          </w:tcPr>
-          <w:p>
-            <w:r/>
-            <w:r>
-              <w:rPr>
-                <w:b/>
-              </w:rPr>
-              <w:t>Item</w:t>
-            </w:r>
-          </w:p>
-        </w:tc>
-        <w:tc>
-          <w:tcPr>
-            <w:tcW w:type="dxa" w:w="4320"/>
-          </w:tcPr>
-          <w:p>
-            <w:r/>
-            <w:r>
-              <w:rPr>
-                <w:b/>
-              </w:rPr>
-              <w:t>Amount</w:t>
-            </w:r>
-          </w:p>
-        </w:tc>
-      </w:tr>
-      <w:tr>
-        <w:tc>
-          <w:tcPr>
-            <w:tcW w:type="dxa" w:w="4320"/>
-          </w:tcPr>
-          <w:p>
-            <w:r>
-              <w:t>High quality liquid assets (HQLA)</w:t>
-            </w:r>
-          </w:p>
-        </w:tc>
-        <w:tc>
-          <w:tcPr>
-            <w:tcW w:type="dxa" w:w="4320"/>
-          </w:tcPr>
-          <w:p>
-            <w:pPr>
-              <w:jc w:val="right"/>
-            </w:pPr>
-            <w:r>
-              <w:t>4,500,000.0</w:t>
-            </w:r>
-          </w:p>
-        </w:tc>
-      </w:tr>
-      <w:tr>
-        <w:tc>
-          <w:tcPr>
-            <w:tcW w:type="dxa" w:w="4320"/>
-          </w:tcPr>
-          <w:p>
-            <w:r>
-              <w:t>Net cash outflows over 30 days</w:t>
-            </w:r>
-          </w:p>
-        </w:tc>
-        <w:tc>
-          <w:tcPr>
-            <w:tcW w:type="dxa" w:w="4320"/>
-          </w:tcPr>
-          <w:p>
-            <w:pPr>
-              <w:jc w:val="right"/>
-            </w:pPr>
-            <w:r>
-              <w:t>3,600,000.0</w:t>
-            </w:r>
-          </w:p>
-        </w:tc>
-      </w:tr>
-      <w:tr>
-        <w:tc>
-          <w:tcPr>
-            <w:tcW w:type="dxa" w:w="4320"/>
-          </w:tcPr>
-          <w:p>
-            <w:r>
-              <w:t>Liquidity Coverage Ratio</w:t>
-            </w:r>
-          </w:p>
-        </w:tc>
-        <w:tc>
-          <w:tcPr>
-            <w:tcW w:type="dxa" w:w="4320"/>
-          </w:tcPr>
-          <w:p>
-            <w:pPr>
-              <w:jc w:val="right"/>
-            </w:pPr>
-            <w:r>
-              <w:t>125.00%</w:t>
-            </w:r>
-          </w:p>
-        </w:tc>
-      </w:tr>
-      <w:tr>
-        <w:tc>
-          <w:tcPr>
-            <w:tcW w:type="dxa" w:w="4320"/>
-          </w:tcPr>
-          <w:p>
-            <w:r>
-              <w:t>Available stable funding</w:t>
-            </w:r>
-          </w:p>
-        </w:tc>
-        <w:tc>
-          <w:tcPr>
-            <w:tcW w:type="dxa" w:w="4320"/>
-          </w:tcPr>
-          <w:p>
-            <w:pPr>
-              <w:jc w:val="right"/>
-            </w:pPr>
-            <w:r>
-              <w:t>18,000,000.0</w:t>
-            </w:r>
-          </w:p>
-        </w:tc>
-      </w:tr>
-      <w:tr>
-        <w:tc>
-          <w:tcPr>
-            <w:tcW w:type="dxa" w:w="4320"/>
-          </w:tcPr>
-          <w:p>
-            <w:r>
-              <w:t>Required stable funding</w:t>
-            </w:r>
-          </w:p>
-        </w:tc>
-        <w:tc>
-          <w:tcPr>
-            <w:tcW w:type="dxa" w:w="4320"/>
-          </w:tcPr>
-          <w:p>
-            <w:pPr>
-              <w:jc w:val="right"/>
-            </w:pPr>
-            <w:r>
-              <w:t>14,400,000.0</w:t>
-            </w:r>
-          </w:p>
-        </w:tc>
-      </w:tr>
-      <w:tr>
-        <w:tc>
-          <w:tcPr>
-            <w:tcW w:type="dxa" w:w="4320"/>
-          </w:tcPr>
-          <w:p>
-            <w:r>
-              <w:t>Net Stable Funding Ratio</w:t>
-            </w:r>
-          </w:p>
-        </w:tc>
-        <w:tc>
-          <w:tcPr>
-            <w:tcW w:type="dxa" w:w="4320"/>
-          </w:tcPr>
-          <w:p>
-            <w:pPr>
-              <w:jc w:val="right"/>
-            </w:pPr>
-            <w:r>
-              <w:t>125.00%</w:t>
-            </w:r>
-          </w:p>
-        </w:tc>
-      </w:tr>
-      <w:tr>
-        <w:tc>
-          <w:tcPr>
-            <w:tcW w:type="dxa" w:w="4320"/>
-          </w:tcPr>
-          <w:p>
-            <w:r>
-              <w:t>RBI minimum for each</w:t>
-            </w:r>
-          </w:p>
-        </w:tc>
-        <w:tc>
-          <w:tcPr>
-            <w:tcW w:type="dxa" w:w="4320"/>
-          </w:tcPr>
-          <w:p>
-            <w:pPr>
-              <w:jc w:val="right"/>
-            </w:pPr>
-            <w:r>
-              <w:t>100.00%</w:t>
-            </w:r>
-          </w:p>
-        </w:tc>
-      </w:tr>
-    </w:tbl>
-    <w:p/>
-    <w:p>
-      <w:pPr>
-        <w:pStyle w:val="Heading1"/>
-      </w:pPr>
-      <w:r>
-        <w:t>Reconciliation against published ratios</w:t>
-      </w:r>
-    </w:p>
-    <w:p>
-      <w:r>
-        <w:rPr>
-          <w:b w:val="0"/>
-          <w:i w:val="0"/>
-        </w:rPr>
-        <w:t>Every ratio computed above is compared with the ratio the bank printed in its own disclosure. A mismatch means the input data or the formula is wrong, and the document must not be issued.</w:t>
-      </w:r>
-    </w:p>
-    <w:tbl>
-      <w:tblPr>
-        <w:tblStyle w:val="LightGrid-Accent1"/>
-        <w:tblW w:type="auto" w:w="0"/>
-        <w:tblLook w:firstColumn="1" w:firstRow="1" w:lastColumn="0" w:lastRow="0" w:noHBand="0" w:noVBand="1" w:val="04A0"/>
-      </w:tblPr>
-      <w:tblGrid>
-        <w:gridCol w:w="2160"/>
-        <w:gridCol w:w="2160"/>
-        <w:gridCol w:w="2160"/>
-        <w:gridCol w:w="2160"/>
-      </w:tblGrid>
-      <w:tr>
-        <w:tc>
-          <w:tcPr>
-            <w:tcW w:type="dxa" w:w="2160"/>
-          </w:tcPr>
-          <w:p>
-            <w:r/>
-            <w:r>
-              <w:rPr>
-                <w:b/>
-              </w:rPr>
-              <w:t>Ratio</w:t>
-            </w:r>
-          </w:p>
-        </w:tc>
-        <w:tc>
-          <w:tcPr>
-            <w:tcW w:type="dxa" w:w="2160"/>
-          </w:tcPr>
-          <w:p>
-            <w:r/>
-            <w:r>
-              <w:rPr>
-                <w:b/>
-              </w:rPr>
-              <w:t>Computed</w:t>
-            </w:r>
-          </w:p>
-        </w:tc>
-        <w:tc>
-          <w:tcPr>
-            <w:tcW w:type="dxa" w:w="2160"/>
-          </w:tcPr>
-          <w:p>
-            <w:r/>
-            <w:r>
-              <w:rPr>
-                <w:b/>
-              </w:rPr>
-              <w:t>Published</w:t>
-            </w:r>
-          </w:p>
-        </w:tc>
-        <w:tc>
-          <w:tcPr>
-            <w:tcW w:type="dxa" w:w="2160"/>
-          </w:tcPr>
-          <w:p>
-            <w:r/>
-            <w:r>
-              <w:rPr>
-                <w:b/>
-              </w:rPr>
-              <w:t>Status</w:t>
-            </w:r>
-          </w:p>
-        </w:tc>
-      </w:tr>
-      <w:tr>
-        <w:tc>
-          <w:tcPr>
-            <w:tcW w:type="dxa" w:w="2160"/>
-          </w:tcPr>
-          <w:p>
-            <w:r>
-              <w:t>CET1 ratio</w:t>
-            </w:r>
-          </w:p>
-        </w:tc>
-        <w:tc>
-          <w:tcPr>
-            <w:tcW w:type="dxa" w:w="2160"/>
-          </w:tcPr>
-          <w:p>
-            <w:pPr>
-              <w:jc w:val="right"/>
-            </w:pPr>
-            <w:r>
-              <w:t>15.81%</w:t>
-            </w:r>
-          </w:p>
-        </w:tc>
-        <w:tc>
-          <w:tcPr>
-            <w:tcW w:type="dxa" w:w="2160"/>
-          </w:tcPr>
-          <w:p>
-            <w:pPr>
-              <w:jc w:val="right"/>
-            </w:pPr>
-            <w:r>
-              <w:t>15.81%</w:t>
-            </w:r>
-          </w:p>
-        </w:tc>
-        <w:tc>
-          <w:tcPr>
-            <w:tcW w:type="dxa" w:w="2160"/>
-          </w:tcPr>
-          <w:p>
-            <w:pPr>
-              <w:jc w:val="right"/>
-            </w:pPr>
-            <w:r>
-              <w:t>Match</w:t>
-            </w:r>
-          </w:p>
-        </w:tc>
-      </w:tr>
-      <w:tr>
-        <w:tc>
-          <w:tcPr>
-            <w:tcW w:type="dxa" w:w="2160"/>
-          </w:tcPr>
-          <w:p>
-            <w:r>
-              <w:t>Tier 1 ratio</w:t>
-            </w:r>
-          </w:p>
-        </w:tc>
-        <w:tc>
-          <w:tcPr>
-            <w:tcW w:type="dxa" w:w="2160"/>
-          </w:tcPr>
-          <w:p>
-            <w:pPr>
-              <w:jc w:val="right"/>
-            </w:pPr>
-            <w:r>
-              <w:t>15.81%</w:t>
-            </w:r>
-          </w:p>
-        </w:tc>
-        <w:tc>
-          <w:tcPr>
-            <w:tcW w:type="dxa" w:w="2160"/>
-          </w:tcPr>
-          <w:p>
-            <w:pPr>
-              <w:jc w:val="right"/>
-            </w:pPr>
-            <w:r>
-              <w:t>15.81%</w:t>
-            </w:r>
-          </w:p>
-        </w:tc>
-        <w:tc>
-          <w:tcPr>
-            <w:tcW w:type="dxa" w:w="2160"/>
-          </w:tcPr>
-          <w:p>
-            <w:pPr>
-              <w:jc w:val="right"/>
-            </w:pPr>
-            <w:r>
-              <w:t>Match</w:t>
-            </w:r>
-          </w:p>
-        </w:tc>
-      </w:tr>
-      <w:tr>
-        <w:tc>
-          <w:tcPr>
-            <w:tcW w:type="dxa" w:w="2160"/>
-          </w:tcPr>
-          <w:p>
-            <w:r>
-              <w:t>Total capital ratio</w:t>
-            </w:r>
-          </w:p>
-        </w:tc>
-        <w:tc>
-          <w:tcPr>
-            <w:tcW w:type="dxa" w:w="2160"/>
-          </w:tcPr>
-          <w:p>
-            <w:pPr>
-              <w:jc w:val="right"/>
-            </w:pPr>
-            <w:r>
-              <w:t>16.41%</w:t>
-            </w:r>
-          </w:p>
-        </w:tc>
-        <w:tc>
-          <w:tcPr>
-            <w:tcW w:type="dxa" w:w="2160"/>
-          </w:tcPr>
-          <w:p>
-            <w:pPr>
-              <w:jc w:val="right"/>
-            </w:pPr>
-            <w:r>
-              <w:t>16.41%</w:t>
-            </w:r>
-          </w:p>
-        </w:tc>
-        <w:tc>
-          <w:tcPr>
-            <w:tcW w:type="dxa" w:w="2160"/>
-          </w:tcPr>
-          <w:p>
-            <w:pPr>
-              <w:jc w:val="right"/>
-            </w:pPr>
-            <w:r>
-              <w:t>Match</w:t>
-            </w:r>
-          </w:p>
-        </w:tc>
-      </w:tr>
-      <w:tr>
-        <w:tc>
-          <w:tcPr>
-            <w:tcW w:type="dxa" w:w="2160"/>
-          </w:tcPr>
-          <w:p>
-            <w:r>
-              <w:t>Leverage ratio</w:t>
-            </w:r>
-          </w:p>
-        </w:tc>
-        <w:tc>
-          <w:tcPr>
-            <w:tcW w:type="dxa" w:w="2160"/>
-          </w:tcPr>
-          <w:p>
-            <w:pPr>
-              <w:jc w:val="right"/>
-            </w:pPr>
-            <w:r>
-              <w:t>10.37%</w:t>
-            </w:r>
-          </w:p>
-        </w:tc>
-        <w:tc>
-          <w:tcPr>
-            <w:tcW w:type="dxa" w:w="2160"/>
-          </w:tcPr>
-          <w:p>
-            <w:pPr>
-              <w:jc w:val="right"/>
-            </w:pPr>
-            <w:r>
-              <w:t>10.37%</w:t>
-            </w:r>
-          </w:p>
-        </w:tc>
-        <w:tc>
-          <w:tcPr>
-            <w:tcW w:type="dxa" w:w="2160"/>
-          </w:tcPr>
-          <w:p>
-            <w:pPr>
-              <w:jc w:val="right"/>
-            </w:pPr>
-            <w:r>
-              <w:t>Match</w:t>
-            </w:r>
-          </w:p>
-        </w:tc>
-      </w:tr>
-    </w:tbl>
-    <w:p/>
-    <w:p>
-      <w:pPr>
-        <w:pStyle w:val="Heading1"/>
-      </w:pPr>
-      <w:r>
-        <w:t>Commentary</w:t>
-      </w:r>
-    </w:p>
-    <w:p>
-      <w:r>
-        <w:rPr>
-          <w:b w:val="0"/>
-          <w:i w:val="0"/>
-        </w:rPr>
-        <w:t>All capital ratios are above the RBI minimum including buffers. The narrowest headroom is on the Total capital ratio at 4.71 percentage points. Credit risk accounts for 86.0% of the total capital requirement, market risk 4.6% and operational risk 9.5%. The leverage ratio of 10.37% is well above the 4.00% D-SIB floor.</w:t>
-      </w:r>
-    </w:p>
-    <w:p>
-      <w:r>
-        <w:rPr>
-          <w:b w:val="0"/>
-          <w:i/>
-          <w:sz w:val="18"/>
-        </w:rPr>
-        <w:t>Lab step: paste the two ratio tables above into any free AI chat and ask for a one-paragraph management commentary. Then check every number in its answer against this document before you keep a word of it.</w:t>
-      </w:r>
-    </w:p>
-    <w:sectPr>
-      <w:pgSz w:w="12240" w:h="15840"/>
-      <w:pgMar w:top="1440" w:right="1800" w:bottom="1440" w:left="1800" w:header="720" w:footer="720" w:gutter="0"/>
-      <w:cols w:space="720"/>
-      <w:docGrid w:linePitch="360"/>
-    </w:sectPr>
   </w:body>
 </w:document>
 </file>
@@ -1886,10 +3915,6 @@
     <w:name w:val="Normal"/>
     <w:qFormat/>
     <w:rsid w:val="00FC693F"/>
-    <w:rPr>
-      <w:rFonts w:ascii="Calibri" w:hAnsi="Calibri"/>
-      <w:sz w:val="21"/>
-    </w:rPr>
   </w:style>
   <w:style w:type="paragraph" w:styleId="Header">
     <w:name w:val="header"/>

</xml_diff>